<commit_message>
Study 3 - Vars Identified
</commit_message>
<xml_diff>
--- a/Thesis Assets/Thesis Proto Thesis.docx
+++ b/Thesis Assets/Thesis Proto Thesis.docx
@@ -2804,7 +2804,15 @@
         <w:t>Repetitive Questions:</w:t>
       </w:r>
       <w:r>
-        <w:t xml:space="preserve"> (rephrasings)</w:t>
+        <w:t xml:space="preserve"> (</w:t>
+      </w:r>
+      <w:proofErr w:type="spellStart"/>
+      <w:r>
+        <w:t>rephrasings</w:t>
+      </w:r>
+      <w:proofErr w:type="spellEnd"/>
+      <w:r>
+        <w:t>)</w:t>
       </w:r>
     </w:p>
     <w:p/>
@@ -2871,10 +2879,10 @@
         </w:rPr>
         <w:lastRenderedPageBreak/>
         <w:drawing>
-          <wp:inline distT="0" distB="0" distL="0" distR="0" wp14:anchorId="1FDA6A57" wp14:editId="520DD8E4">
-            <wp:extent cx="5943600" cy="4916805"/>
-            <wp:effectExtent l="12700" t="12700" r="12700" b="10795"/>
-            <wp:docPr id="2" name="Picture 2"/>
+          <wp:inline distT="0" distB="0" distL="0" distR="0" wp14:anchorId="797754E7" wp14:editId="1993A12A">
+            <wp:extent cx="5816600" cy="8229600"/>
+            <wp:effectExtent l="12700" t="12700" r="12700" b="12700"/>
+            <wp:docPr id="4" name="Picture 4"/>
             <wp:cNvGraphicFramePr>
               <a:graphicFrameLocks xmlns:a="http://schemas.openxmlformats.org/drawingml/2006/main" noChangeAspect="1"/>
             </wp:cNvGraphicFramePr>
@@ -2882,7 +2890,7 @@
               <a:graphicData uri="http://schemas.openxmlformats.org/drawingml/2006/picture">
                 <pic:pic xmlns:pic="http://schemas.openxmlformats.org/drawingml/2006/picture">
                   <pic:nvPicPr>
-                    <pic:cNvPr id="2" name="Picture 2"/>
+                    <pic:cNvPr id="4" name="Picture 4"/>
                     <pic:cNvPicPr/>
                   </pic:nvPicPr>
                   <pic:blipFill>
@@ -2900,7 +2908,7 @@
                   <pic:spPr>
                     <a:xfrm>
                       <a:off x="0" y="0"/>
-                      <a:ext cx="5943600" cy="4916805"/>
+                      <a:ext cx="5816600" cy="8229600"/>
                     </a:xfrm>
                     <a:prstGeom prst="rect">
                       <a:avLst/>
@@ -2932,6 +2940,7 @@
           <w:sz w:val="20"/>
           <w:szCs w:val="20"/>
         </w:rPr>
+        <w:lastRenderedPageBreak/>
         <w:t xml:space="preserve">Figure </w:t>
       </w:r>
       <w:r>
@@ -2994,57 +3003,523 @@
         <w:t>t</w:t>
       </w:r>
     </w:p>
-    <w:p/>
-    <w:p>
-      <w:r>
-        <w:t>Fauci</w:t>
-      </w:r>
-    </w:p>
-    <w:p>
-      <w:r>
-        <w:t>Scientists</w:t>
-      </w:r>
-    </w:p>
-    <w:p>
-      <w:r>
-        <w:t>Climate Impact</w:t>
-      </w:r>
-    </w:p>
-    <w:p>
-      <w:r>
-        <w:t>Climate Issue Importance</w:t>
-      </w:r>
-    </w:p>
-    <w:p>
-      <w:r>
-        <w:t>Left Right Self</w:t>
-      </w:r>
-    </w:p>
-    <w:p>
-      <w:r>
-        <w:t>Matters who is in Power</w:t>
-      </w:r>
-    </w:p>
-    <w:p>
-      <w:r>
-        <w:t>Changing World and Morals</w:t>
-      </w:r>
-    </w:p>
-    <w:p>
-      <w:r>
-        <w:t>Government Performance 4 years</w:t>
-      </w:r>
-    </w:p>
-    <w:p>
-      <w:r>
-        <w:t>Differences in Major Parties</w:t>
-      </w:r>
-    </w:p>
-    <w:p>
-      <w:r>
-        <w:t>Economy 12 months</w:t>
-      </w:r>
-    </w:p>
+    <w:p>
+      <w:r>
+        <w:t xml:space="preserve">Results are listed in descending order of p-value, which coincides roughly with the absolute value of the t-statistic. </w:t>
+      </w:r>
+      <w:proofErr w:type="gramStart"/>
+      <w:r>
+        <w:t xml:space="preserve">Before beginning </w:t>
+      </w:r>
+      <w:r>
+        <w:t xml:space="preserve">an </w:t>
+      </w:r>
+      <w:r>
+        <w:t>analysis</w:t>
+      </w:r>
+      <w:r>
+        <w:t xml:space="preserve"> of these tests</w:t>
+      </w:r>
+      <w:r>
+        <w:t>, it</w:t>
+      </w:r>
+      <w:proofErr w:type="gramEnd"/>
+      <w:r>
+        <w:t xml:space="preserve"> should be noted that a simple mean or even a t-statistic is rarely enough to fully grasp the differences in distribution voter groups, as the scales of certain variables are prone to irregular distribution shapes, such as heavy skews, multi-modality, and kurtosis that are best understood alongside a visual reference. </w:t>
+      </w:r>
+      <w:r>
+        <w:t>This analysis will highlight the important shape irregularities in the key variables, but an interested reader may consult the appendix for a full view of all distributions for the above variables.</w:t>
+      </w:r>
+    </w:p>
+    <w:p/>
+    <w:p>
+      <w:r>
+        <w:t xml:space="preserve">The results of these tests help us inform the formulation of a theory of who a Change Voter might be. First, and perhaps most interestingly, are the two variables related to the feeling of the </w:t>
+      </w:r>
+      <w:r>
+        <w:t>survey respondent</w:t>
+      </w:r>
+      <w:r>
+        <w:t xml:space="preserve"> towards Dr. Anthony Fauci (who held the position of Chief Medical Advisor to the President during the</w:t>
+      </w:r>
+      <w:r>
+        <w:t xml:space="preserve"> time at which this</w:t>
+      </w:r>
+      <w:r>
+        <w:t xml:space="preserve"> survey</w:t>
+      </w:r>
+      <w:r>
+        <w:t xml:space="preserve"> was conducted) and 'Scientists' as a general group. Respondents, asked to give a number between 0-100 representing how 'favourably' they felt towards Dr. Fauci and towards 'Scientists', were significantly more likely to give a positive score if they were </w:t>
+      </w:r>
+      <w:proofErr w:type="spellStart"/>
+      <w:r>
+        <w:t>CVoters</w:t>
+      </w:r>
+      <w:proofErr w:type="spellEnd"/>
+      <w:r>
+        <w:t xml:space="preserve">. While the t-statistic (as noted earlier) does not paint the whole story, it tells us that, on average, </w:t>
+      </w:r>
+      <w:proofErr w:type="spellStart"/>
+      <w:r>
+        <w:t>CVoters</w:t>
+      </w:r>
+      <w:proofErr w:type="spellEnd"/>
+      <w:r>
+        <w:t xml:space="preserve"> see Dr. Fauci six points more favourably than </w:t>
+      </w:r>
+      <w:proofErr w:type="spellStart"/>
+      <w:r>
+        <w:t>MVoters</w:t>
+      </w:r>
+      <w:proofErr w:type="spellEnd"/>
+      <w:r>
+        <w:t>, and Scientists five points more favourably, adjusted for variance. Figure 2 below expands on this to show just how severe the difference in distributions really is.</w:t>
+      </w:r>
+      <w:r>
+        <w:t xml:space="preserve"> For Dr. Fauci, we see the great majority of respondents score him at seventy-five or above, while Scientists receive a similar (though less extremely distinct) scoring trend.</w:t>
+      </w:r>
+      <w:r>
+        <w:t xml:space="preserve"> </w:t>
+      </w:r>
+    </w:p>
+    <w:p/>
+    <w:p>
+      <w:pPr>
+        <w:keepNext/>
+      </w:pPr>
+      <w:r>
+        <w:rPr>
+          <w:noProof/>
+        </w:rPr>
+        <w:drawing>
+          <wp:inline distT="0" distB="0" distL="0" distR="0" wp14:anchorId="06C9E98C" wp14:editId="01B6F27B">
+            <wp:extent cx="5943600" cy="3185160"/>
+            <wp:effectExtent l="12700" t="12700" r="12700" b="15240"/>
+            <wp:docPr id="5" name="Picture 5"/>
+            <wp:cNvGraphicFramePr>
+              <a:graphicFrameLocks xmlns:a="http://schemas.openxmlformats.org/drawingml/2006/main" noChangeAspect="1"/>
+            </wp:cNvGraphicFramePr>
+            <a:graphic xmlns:a="http://schemas.openxmlformats.org/drawingml/2006/main">
+              <a:graphicData uri="http://schemas.openxmlformats.org/drawingml/2006/picture">
+                <pic:pic xmlns:pic="http://schemas.openxmlformats.org/drawingml/2006/picture">
+                  <pic:nvPicPr>
+                    <pic:cNvPr id="5" name="Picture 5"/>
+                    <pic:cNvPicPr/>
+                  </pic:nvPicPr>
+                  <pic:blipFill>
+                    <a:blip r:embed="rId7" cstate="print">
+                      <a:extLst>
+                        <a:ext uri="{28A0092B-C50C-407E-A947-70E740481C1C}">
+                          <a14:useLocalDpi xmlns:a14="http://schemas.microsoft.com/office/drawing/2010/main" val="0"/>
+                        </a:ext>
+                      </a:extLst>
+                    </a:blip>
+                    <a:stretch>
+                      <a:fillRect/>
+                    </a:stretch>
+                  </pic:blipFill>
+                  <pic:spPr>
+                    <a:xfrm>
+                      <a:off x="0" y="0"/>
+                      <a:ext cx="5943600" cy="3185160"/>
+                    </a:xfrm>
+                    <a:prstGeom prst="rect">
+                      <a:avLst/>
+                    </a:prstGeom>
+                    <a:ln>
+                      <a:solidFill>
+                        <a:srgbClr val="4472C4"/>
+                      </a:solidFill>
+                    </a:ln>
+                  </pic:spPr>
+                </pic:pic>
+              </a:graphicData>
+            </a:graphic>
+          </wp:inline>
+        </w:drawing>
+      </w:r>
+    </w:p>
+    <w:p>
+      <w:pPr>
+        <w:pStyle w:val="Caption"/>
+        <w:jc w:val="center"/>
+      </w:pPr>
+      <w:r>
+        <w:t xml:space="preserve">Figure </w:t>
+      </w:r>
+      <w:fldSimple w:instr=" SEQ Figure \* ARABIC ">
+        <w:r>
+          <w:rPr>
+            <w:noProof/>
+          </w:rPr>
+          <w:t>2</w:t>
+        </w:r>
+      </w:fldSimple>
+      <w:r>
+        <w:t xml:space="preserve">, Distribution Comparison between </w:t>
+      </w:r>
+      <w:proofErr w:type="spellStart"/>
+      <w:r>
+        <w:t>CVoter</w:t>
+      </w:r>
+      <w:proofErr w:type="spellEnd"/>
+      <w:r>
+        <w:t xml:space="preserve"> and </w:t>
+      </w:r>
+      <w:proofErr w:type="spellStart"/>
+      <w:r>
+        <w:t>MVoter</w:t>
+      </w:r>
+      <w:proofErr w:type="spellEnd"/>
+      <w:r>
+        <w:t xml:space="preserve"> scores for Dr. Fauci and 'Scientists'</w:t>
+      </w:r>
+    </w:p>
+    <w:p/>
+    <w:p/>
+    <w:p/>
+    <w:p/>
+    <w:p>
+      <w:r>
+        <w:t>Family income - on average 10,000 USD lower</w:t>
+      </w:r>
+    </w:p>
+    <w:p>
+      <w:proofErr w:type="spellStart"/>
+      <w:r>
+        <w:t>Therm</w:t>
+      </w:r>
+      <w:proofErr w:type="spellEnd"/>
+      <w:r>
+        <w:t>: labour unions - more favourable - explains the</w:t>
+      </w:r>
+      <w:r>
+        <w:t xml:space="preserve"> 2020</w:t>
+      </w:r>
+      <w:r>
+        <w:t xml:space="preserve"> bi</w:t>
+      </w:r>
+      <w:proofErr w:type="spellStart"/>
+      <w:r>
+        <w:t>den</w:t>
+      </w:r>
+      <w:proofErr w:type="spellEnd"/>
+      <w:r>
+        <w:t xml:space="preserve"> vote and could also explain why trump vote in 1</w:t>
+      </w:r>
+      <w:r>
+        <w:t>6</w:t>
+      </w:r>
+      <w:r>
+        <w:t>: pro-working class</w:t>
+      </w:r>
+      <w:r>
+        <w:t>. Means probably also Trump in</w:t>
+      </w:r>
+      <w:r>
+        <w:t xml:space="preserve"> 24</w:t>
+      </w:r>
+      <w:r>
+        <w:t xml:space="preserve"> since pro manufacturing</w:t>
+      </w:r>
+    </w:p>
+    <w:p>
+      <w:r>
+        <w:t>Economy 12 months - worse</w:t>
+      </w:r>
+    </w:p>
+    <w:p>
+      <w:r>
+        <w:t>Income Gap 20 years - larger (worse)</w:t>
+      </w:r>
+    </w:p>
+    <w:p/>
+    <w:p>
+      <w:r>
+        <w:t>Climate issue - More important</w:t>
+      </w:r>
+    </w:p>
+    <w:p>
+      <w:r>
+        <w:t>Hopeful about things in US - less hopeful</w:t>
+      </w:r>
+    </w:p>
+    <w:p>
+      <w:r>
+        <w:t>Happy about things in US - less happy</w:t>
+      </w:r>
+    </w:p>
+    <w:p>
+      <w:r>
+        <w:t xml:space="preserve">Government last 4 </w:t>
+      </w:r>
+      <w:proofErr w:type="spellStart"/>
+      <w:r>
+        <w:t>yrs</w:t>
+      </w:r>
+      <w:proofErr w:type="spellEnd"/>
+      <w:r>
+        <w:t xml:space="preserve"> - worse</w:t>
+      </w:r>
+    </w:p>
+    <w:p/>
+    <w:p>
+      <w:r>
+        <w:t>Fauci - More favourable</w:t>
+      </w:r>
+    </w:p>
+    <w:p>
+      <w:r>
+        <w:t>Scientists - More Favourable</w:t>
+      </w:r>
+    </w:p>
+    <w:p>
+      <w:r>
+        <w:t>Climate on US - More impact</w:t>
+      </w:r>
+    </w:p>
+    <w:p>
+      <w:r>
+        <w:t>Morals should change - agree more</w:t>
+      </w:r>
+      <w:r>
+        <w:t xml:space="preserve"> (forward looking, open minded)</w:t>
+      </w:r>
+    </w:p>
+    <w:p/>
+    <w:p>
+      <w:r>
+        <w:t xml:space="preserve">Left Right Self - 4.93 vs 5.63 (and extremely modal around 5. need graph to show </w:t>
+      </w:r>
+      <w:r>
+        <w:t>this</w:t>
+      </w:r>
+      <w:r>
+        <w:t>)</w:t>
+      </w:r>
+    </w:p>
+    <w:p>
+      <w:r>
+        <w:t>Difference in major parties - Less difference</w:t>
+      </w:r>
+    </w:p>
+    <w:p>
+      <w:r>
+        <w:t>Matters who in power - less difference</w:t>
+      </w:r>
+    </w:p>
+    <w:p>
+      <w:r>
+        <w:t xml:space="preserve">Recall pence </w:t>
+      </w:r>
+      <w:proofErr w:type="gramStart"/>
+      <w:r>
+        <w:t>-  more</w:t>
+      </w:r>
+      <w:proofErr w:type="gramEnd"/>
+      <w:r>
+        <w:t xml:space="preserve"> incorrect, but only 5% difference</w:t>
+      </w:r>
+    </w:p>
+    <w:p/>
+    <w:p>
+      <w:r>
+        <w:t>Branches govt check each other - less important</w:t>
+      </w:r>
+    </w:p>
+    <w:p>
+      <w:r>
+        <w:t>Importance: news orgs criticize - Less important</w:t>
+      </w:r>
+    </w:p>
+    <w:p>
+      <w:r>
+        <w:t>O</w:t>
+      </w:r>
+      <w:r>
+        <w:t>fficials misconduct consequences - less important</w:t>
+      </w:r>
+    </w:p>
+    <w:p>
+      <w:r>
+        <w:t xml:space="preserve">Voting duty/ choice - duty, but less strongly than </w:t>
+      </w:r>
+      <w:proofErr w:type="spellStart"/>
+      <w:r>
+        <w:t>MVoter</w:t>
+      </w:r>
+      <w:proofErr w:type="spellEnd"/>
+    </w:p>
+    <w:p/>
+    <w:p>
+      <w:r>
+        <w:t>-----------------------------------------------------------------------------------------------</w:t>
+      </w:r>
+    </w:p>
+    <w:p>
+      <w:r>
+        <w:t>Econ situation</w:t>
+      </w:r>
+      <w:r>
+        <w:t xml:space="preserve"> (personal)</w:t>
+      </w:r>
+      <w:r>
+        <w:t>: bad</w:t>
+      </w:r>
+    </w:p>
+    <w:p>
+      <w:r>
+        <w:t>Econ perception: worsening</w:t>
+      </w:r>
+    </w:p>
+    <w:p/>
+    <w:p>
+      <w:r>
+        <w:t>Outlook of future: pessimistic, but realistic</w:t>
+      </w:r>
+    </w:p>
+    <w:p>
+      <w:r>
+        <w:t>Retrospective view: bad</w:t>
+      </w:r>
+    </w:p>
+    <w:p>
+      <w:r>
+        <w:t>Meaning we get our first theory confirmation, which is that these people are in a constant state of stress/ crisis</w:t>
+      </w:r>
+      <w:r>
+        <w:t>, caught in the "past bad, future worse"</w:t>
+      </w:r>
+    </w:p>
+    <w:p/>
+    <w:p>
+      <w:r>
+        <w:t>Believes in Science</w:t>
+      </w:r>
+      <w:r>
+        <w:t xml:space="preserve">: </w:t>
+      </w:r>
+      <w:r>
+        <w:t>Fauci, Scientists, Climate Change being real</w:t>
+      </w:r>
+    </w:p>
+    <w:p>
+      <w:r>
+        <w:t>Believes in Change/ has Open Mind</w:t>
+      </w:r>
+      <w:r>
+        <w:t xml:space="preserve">: World is </w:t>
+      </w:r>
+      <w:proofErr w:type="gramStart"/>
+      <w:r>
+        <w:t>changing</w:t>
+      </w:r>
+      <w:proofErr w:type="gramEnd"/>
+      <w:r>
+        <w:t xml:space="preserve"> and we need to as well</w:t>
+      </w:r>
+    </w:p>
+    <w:p/>
+    <w:p>
+      <w:r>
+        <w:t>But Apathetic and Tired of political establishment: conscious non-alignment</w:t>
+      </w:r>
+      <w:r>
+        <w:t>, no diff between the parties, no difference who in power</w:t>
+      </w:r>
+    </w:p>
+    <w:p>
+      <w:r>
+        <w:t xml:space="preserve">Not necessarily low info: </w:t>
+      </w:r>
+      <w:proofErr w:type="gramStart"/>
+      <w:r>
+        <w:t>yes</w:t>
+      </w:r>
+      <w:proofErr w:type="gramEnd"/>
+      <w:r>
+        <w:t xml:space="preserve"> pence lower recall, but notably variables Pelosi, Merkel, </w:t>
+      </w:r>
+      <w:r>
+        <w:t xml:space="preserve">SCOTUS were some of the least independent. </w:t>
+      </w:r>
+      <w:r>
+        <w:rPr>
+          <w:b/>
+          <w:bCs/>
+        </w:rPr>
+        <w:t>pull out those numbers</w:t>
+      </w:r>
+      <w:r>
+        <w:t xml:space="preserve">. </w:t>
+      </w:r>
+      <w:proofErr w:type="gramStart"/>
+      <w:r>
+        <w:rPr>
+          <w:b/>
+          <w:bCs/>
+        </w:rPr>
+        <w:t>Also</w:t>
+      </w:r>
+      <w:proofErr w:type="gramEnd"/>
+      <w:r>
+        <w:rPr>
+          <w:b/>
+          <w:bCs/>
+        </w:rPr>
+        <w:t xml:space="preserve"> maybe in appendix have the table for all variables</w:t>
+      </w:r>
+      <w:r>
+        <w:t>.</w:t>
+      </w:r>
+    </w:p>
+    <w:p/>
+    <w:p>
+      <w:r>
+        <w:lastRenderedPageBreak/>
+        <w:t xml:space="preserve">Yes informed, but </w:t>
+      </w:r>
+      <w:r>
+        <w:t>has more pressing problems than 'democracy':</w:t>
+      </w:r>
+      <w:r>
+        <w:t xml:space="preserve"> </w:t>
+      </w:r>
+      <w:proofErr w:type="gramStart"/>
+      <w:r>
+        <w:t>Yes</w:t>
+      </w:r>
+      <w:proofErr w:type="gramEnd"/>
+      <w:r>
+        <w:t xml:space="preserve"> free media important, but LESS important than... affordability for ex</w:t>
+      </w:r>
+      <w:r>
+        <w:t xml:space="preserve">, Yes important branches of govt check each other, but LESS important </w:t>
+      </w:r>
+      <w:r>
+        <w:t>[</w:t>
+      </w:r>
+      <w:r>
+        <w:t xml:space="preserve">checks out with </w:t>
+      </w:r>
+      <w:proofErr w:type="spellStart"/>
+      <w:r>
+        <w:t>harris</w:t>
+      </w:r>
+      <w:proofErr w:type="spellEnd"/>
+      <w:r>
+        <w:t xml:space="preserve"> message falling flat</w:t>
+      </w:r>
+      <w:r>
+        <w:t>, and why Trump24 was not perceived as threat</w:t>
+      </w:r>
+      <w:r>
+        <w:t>]</w:t>
+      </w:r>
+    </w:p>
+    <w:p/>
+    <w:p/>
+    <w:p/>
     <w:p/>
     <w:p/>
     <w:p/>
@@ -3067,6 +3542,105 @@
       </w:r>
     </w:p>
     <w:p>
+      <w:r>
+        <w:t>Following the results of our distributional independence testing,</w:t>
+      </w:r>
+      <w:r>
+        <w:t xml:space="preserve"> we can group the results into a </w:t>
+      </w:r>
+      <w:r>
+        <w:t>first archetype of who these Change Voters are.</w:t>
+      </w:r>
+    </w:p>
+    <w:p/>
+    <w:p>
+      <w:r>
+        <w:t xml:space="preserve">First, they have a positive opinion and respect for </w:t>
+      </w:r>
+      <w:r>
+        <w:t>science</w:t>
+      </w:r>
+      <w:r>
+        <w:t xml:space="preserve"> and expertise, which is extended to authority and those in positions of power. (Fauci, Scientists, Public Officials, Effects of Climate Change).</w:t>
+      </w:r>
+    </w:p>
+    <w:p>
+      <w:r>
+        <w:t xml:space="preserve">Second, they are </w:t>
+      </w:r>
+      <w:r>
+        <w:t xml:space="preserve">overwhelmingly </w:t>
+      </w:r>
+      <w:r>
+        <w:t>politically unaligned</w:t>
+      </w:r>
+      <w:r>
+        <w:t>.</w:t>
+      </w:r>
+      <w:r>
+        <w:t xml:space="preserve"> This is perhaps one of the most interesting insights, as the variable "Left-Right Self-Reported" on its own could be interpreted as the </w:t>
+      </w:r>
+      <w:proofErr w:type="spellStart"/>
+      <w:r>
+        <w:t>CVoter</w:t>
+      </w:r>
+      <w:proofErr w:type="spellEnd"/>
+      <w:r>
+        <w:t xml:space="preserve"> being a 'centrist' voter; however, </w:t>
+      </w:r>
+      <w:r>
+        <w:t xml:space="preserve">the extreme unimodality of this result </w:t>
+      </w:r>
+      <w:r>
+        <w:t xml:space="preserve">when seen alongside the apathetic results </w:t>
+      </w:r>
+      <w:r>
+        <w:t xml:space="preserve">of these voters for the questions regarding </w:t>
+      </w:r>
+    </w:p>
+    <w:p>
+      <w:r>
+        <w:t xml:space="preserve">Third, they are future-looking </w:t>
+      </w:r>
+      <w:r>
+        <w:t>and open-minded</w:t>
+      </w:r>
+      <w:r>
+        <w:t xml:space="preserve"> (</w:t>
+      </w:r>
+      <w:r>
+        <w:t>belief in climate change</w:t>
+      </w:r>
+      <w:r>
+        <w:t xml:space="preserve">, </w:t>
+      </w:r>
+      <w:r>
+        <w:t>morals should change</w:t>
+      </w:r>
+      <w:r>
+        <w:t>)</w:t>
+      </w:r>
+    </w:p>
+    <w:p>
+      <w:r>
+        <w:t>Pessimistic about economic outlook and trends, as well as less financially rich (12 Months, Income Gap, Family Income)</w:t>
+      </w:r>
+    </w:p>
+    <w:p/>
+    <w:p>
+      <w:r>
+        <w:t>low understanding of democratic processes/ institutions</w:t>
+      </w:r>
+    </w:p>
+    <w:p>
+      <w:r>
+        <w:t>BUT: ‘classic’ information gaps - even SCOTUS! so they are in tune politically</w:t>
+      </w:r>
+    </w:p>
+    <w:p/>
+    <w:p/>
+    <w:p/>
+    <w:p>
       <w:pPr>
         <w:ind w:firstLine="240"/>
       </w:pPr>
@@ -3087,7 +3661,6 @@
         <w:ind w:firstLine="480"/>
       </w:pPr>
       <w:r>
-        <w:lastRenderedPageBreak/>
         <w:t>6</w:t>
       </w:r>
       <w:r>

</xml_diff>

<commit_message>
Study 3 V2 Finished
</commit_message>
<xml_diff>
--- a/Thesis Assets/Thesis Proto Thesis.docx
+++ b/Thesis Assets/Thesis Proto Thesis.docx
@@ -3335,27 +3335,31 @@
     </w:p>
     <w:p>
       <w:r>
-        <w:rPr>
-          <w:b/>
-          <w:bCs/>
-        </w:rPr>
-        <w:t xml:space="preserve">5.1 </w:t>
-      </w:r>
-      <w:proofErr w:type="spellStart"/>
-      <w:r>
-        <w:rPr>
-          <w:b/>
-          <w:bCs/>
-        </w:rPr>
-        <w:t>NGram</w:t>
-      </w:r>
-      <w:proofErr w:type="spellEnd"/>
-      <w:r>
-        <w:rPr>
-          <w:b/>
-          <w:bCs/>
-        </w:rPr>
-        <w:t xml:space="preserve"> </w:t>
+        <w:t xml:space="preserve">The first experiment of this study profiles the level of 'change' posturing that each candidate attempts. To reach these profiles, two approaches are used, building on each other. </w:t>
+      </w:r>
+    </w:p>
+    <w:p/>
+    <w:p>
+      <w:r>
+        <w:rPr>
+          <w:b/>
+          <w:bCs/>
+        </w:rPr>
+        <w:t>5.1 N</w:t>
+      </w:r>
+      <w:r>
+        <w:rPr>
+          <w:b/>
+          <w:bCs/>
+        </w:rPr>
+        <w:t>-</w:t>
+      </w:r>
+      <w:r>
+        <w:rPr>
+          <w:b/>
+          <w:bCs/>
+        </w:rPr>
+        <w:t xml:space="preserve">Gram </w:t>
       </w:r>
       <w:r>
         <w:rPr>
@@ -3373,12 +3377,95 @@
       </w:r>
     </w:p>
     <w:p>
-      <w:proofErr w:type="spellStart"/>
-      <w:r>
-        <w:t>asdasd</w:t>
-      </w:r>
-      <w:proofErr w:type="spellEnd"/>
-    </w:p>
+      <w:r>
+        <w:t>The first of these is a textual analysis on candidate vocabulary. In simple terms, the idea is to look at the words that candidates use in their speeches, interviews, and press releases, to determine which candidates have most strongly focused their messaging on 'change' and its related ideas. The basis for this textual analysis is the corpus of Campaign Documents scraped from the UCSB's APP, which is then grouped by election year and candidate.</w:t>
+      </w:r>
+    </w:p>
+    <w:p/>
+    <w:p>
+      <w:r>
+        <w:t xml:space="preserve">The physical text analysis is a relatively simple dictionary-based frequency count approach, which takes a set of </w:t>
+      </w:r>
+      <w:proofErr w:type="gramStart"/>
+      <w:r>
+        <w:t>previously-defined</w:t>
+      </w:r>
+      <w:proofErr w:type="gramEnd"/>
+      <w:r>
+        <w:t xml:space="preserve"> words relating to the topic of political 'change' and counts how often they each appear in each document.</w:t>
+      </w:r>
+      <w:r>
+        <w:t xml:space="preserve"> The dictionary used in this study was constructed for this paper, and can be found in </w:t>
+      </w:r>
+      <w:r>
+        <w:rPr>
+          <w:highlight w:val="magenta"/>
+        </w:rPr>
+        <w:t>Appendix A</w:t>
+      </w:r>
+      <w:r>
+        <w:t xml:space="preserve">. The dictionary was built around </w:t>
+      </w:r>
+      <w:r>
+        <w:rPr>
+          <w:highlight w:val="magenta"/>
+        </w:rPr>
+        <w:t>four key topics</w:t>
+      </w:r>
+      <w:r>
+        <w:t xml:space="preserve"> around political 'change'</w:t>
+      </w:r>
+      <w:r>
+        <w:t xml:space="preserve">, " ", " ", " </w:t>
+      </w:r>
+      <w:proofErr w:type="gramStart"/>
+      <w:r>
+        <w:t>",  and</w:t>
+      </w:r>
+      <w:proofErr w:type="gramEnd"/>
+      <w:r>
+        <w:t xml:space="preserve"> " ", for which specific verbs and nouns were identified and stemmed</w:t>
+      </w:r>
+      <w:r>
+        <w:rPr>
+          <w:rStyle w:val="FootnoteReference"/>
+        </w:rPr>
+        <w:footnoteReference w:id="2"/>
+      </w:r>
+      <w:r>
+        <w:t xml:space="preserve">. While the dictionary mainly employs </w:t>
+      </w:r>
+      <w:proofErr w:type="gramStart"/>
+      <w:r>
+        <w:t>Uni-Grams</w:t>
+      </w:r>
+      <w:proofErr w:type="gramEnd"/>
+      <w:r>
+        <w:rPr>
+          <w:rStyle w:val="FootnoteReference"/>
+        </w:rPr>
+        <w:footnoteReference w:id="3"/>
+      </w:r>
+      <w:r>
+        <w:t>, several key N-Grams were also identified and utilized.</w:t>
+      </w:r>
+    </w:p>
+    <w:p/>
+    <w:p>
+      <w:r>
+        <w:t>The results of the dictionary frequency matching</w:t>
+      </w:r>
+      <w:r>
+        <w:t xml:space="preserve"> </w:t>
+      </w:r>
+      <w:r>
+        <w:t xml:space="preserve">are then </w:t>
+      </w:r>
+      <w:r>
+        <w:t>averaged for each candidate to arrive at a percentage use of 'change grams', which serves as the basis for further quantitative elaboration of measures.</w:t>
+      </w:r>
+    </w:p>
+    <w:p/>
     <w:p>
       <w:pPr>
         <w:pStyle w:val="TOC2"/>
@@ -3387,6 +3474,8 @@
       </w:pPr>
     </w:p>
     <w:p/>
+    <w:p/>
+    <w:p/>
     <w:p>
       <w:r>
         <w:rPr>
@@ -3418,12 +3507,806 @@
       </w:r>
     </w:p>
     <w:p>
+      <w:pPr>
+        <w:rPr>
+          <w:rFonts w:eastAsiaTheme="minorEastAsia"/>
+        </w:rPr>
+      </w:pPr>
+      <w:r>
+        <w:t>A Composite Index (CI) is an excellent tool for tackling concepts that are not easily measurable, such as the 'Degree of Change' that a candidate represents in a presidential election. The CI (referred to</w:t>
+      </w:r>
+      <w:r>
+        <w:t xml:space="preserve"> also</w:t>
+      </w:r>
+      <w:r>
+        <w:t xml:space="preserve"> as a Composite Indicator) approaches this issue by instead combining several different variables (indicators</w:t>
+      </w:r>
+      <w:r>
+        <w:t>/ variables</w:t>
+      </w:r>
+      <w:r>
+        <w:t xml:space="preserve">) that are related to the unmeasurable concept in an attempt to approximate its true value. </w:t>
+      </w:r>
+      <w:r>
+        <w:rPr>
+          <w:rFonts w:eastAsiaTheme="minorEastAsia"/>
+        </w:rPr>
+        <w:t xml:space="preserve">For our study, we </w:t>
+      </w:r>
+      <w:r>
+        <w:rPr>
+          <w:rFonts w:eastAsiaTheme="minorEastAsia"/>
+        </w:rPr>
+        <w:t>attempt to measure</w:t>
+      </w:r>
+      <w:r>
+        <w:rPr>
+          <w:rFonts w:eastAsiaTheme="minorEastAsia"/>
+        </w:rPr>
+        <w:t xml:space="preserve"> a candidate's 'Degree of Change</w:t>
+      </w:r>
+      <w:proofErr w:type="gramStart"/>
+      <w:r>
+        <w:rPr>
+          <w:rFonts w:eastAsiaTheme="minorEastAsia"/>
+        </w:rPr>
+        <w:t>'</w:t>
+      </w:r>
+      <w:r>
+        <w:rPr>
+          <w:rFonts w:eastAsiaTheme="minorEastAsia"/>
+        </w:rPr>
+        <w:t>, and</w:t>
+      </w:r>
+      <w:proofErr w:type="gramEnd"/>
+      <w:r>
+        <w:rPr>
+          <w:rFonts w:eastAsiaTheme="minorEastAsia"/>
+        </w:rPr>
+        <w:t xml:space="preserve"> conceptualize of it</w:t>
+      </w:r>
+      <w:r>
+        <w:rPr>
+          <w:rFonts w:eastAsiaTheme="minorEastAsia"/>
+        </w:rPr>
+        <w:t xml:space="preserve"> </w:t>
+      </w:r>
+      <w:r>
+        <w:rPr>
+          <w:rFonts w:eastAsiaTheme="minorEastAsia"/>
+        </w:rPr>
+        <w:t>as including a candidate's</w:t>
+      </w:r>
+      <w:r>
+        <w:rPr>
+          <w:rFonts w:eastAsiaTheme="minorEastAsia"/>
+        </w:rPr>
+        <w:t xml:space="preserve"> '</w:t>
+      </w:r>
+      <w:r>
+        <w:rPr>
+          <w:rFonts w:eastAsiaTheme="minorEastAsia"/>
+        </w:rPr>
+        <w:t>P</w:t>
+      </w:r>
+      <w:r>
+        <w:rPr>
+          <w:rFonts w:eastAsiaTheme="minorEastAsia"/>
+        </w:rPr>
+        <w:t xml:space="preserve">osturing' </w:t>
+      </w:r>
+      <w:r>
+        <w:rPr>
+          <w:rFonts w:eastAsiaTheme="minorEastAsia"/>
+        </w:rPr>
+        <w:t xml:space="preserve">(the image they put forth) </w:t>
+      </w:r>
+      <w:r>
+        <w:rPr>
+          <w:rFonts w:eastAsiaTheme="minorEastAsia"/>
+        </w:rPr>
+        <w:t xml:space="preserve">and their </w:t>
+      </w:r>
+      <w:r>
+        <w:rPr>
+          <w:rFonts w:eastAsiaTheme="minorEastAsia"/>
+        </w:rPr>
+        <w:t>'A</w:t>
+      </w:r>
+      <w:r>
+        <w:rPr>
+          <w:rFonts w:eastAsiaTheme="minorEastAsia"/>
+        </w:rPr>
+        <w:t>ttributes' (</w:t>
+      </w:r>
+      <w:r>
+        <w:rPr>
+          <w:rFonts w:eastAsiaTheme="minorEastAsia"/>
+        </w:rPr>
+        <w:t>traits they don't have control over</w:t>
+      </w:r>
+      <w:r>
+        <w:rPr>
+          <w:rFonts w:eastAsiaTheme="minorEastAsia"/>
+        </w:rPr>
+        <w:t>)</w:t>
+      </w:r>
+      <w:r>
+        <w:rPr>
+          <w:rFonts w:eastAsiaTheme="minorEastAsia"/>
+        </w:rPr>
+        <w:t xml:space="preserve">. </w:t>
+      </w:r>
+    </w:p>
+    <w:p>
+      <w:pPr>
+        <w:rPr>
+          <w:rFonts w:eastAsiaTheme="minorEastAsia"/>
+        </w:rPr>
+      </w:pPr>
+      <w:r>
+        <w:rPr>
+          <w:rFonts w:eastAsiaTheme="minorEastAsia"/>
+        </w:rPr>
+        <w:t xml:space="preserve">The 'Posturing' aspect of a candidate, being the manner in which they express themselves, is derived for our study from </w:t>
+      </w:r>
+      <w:r>
+        <w:rPr>
+          <w:rFonts w:eastAsiaTheme="minorEastAsia"/>
+        </w:rPr>
+        <w:t xml:space="preserve">the results </w:t>
+      </w:r>
+      <w:r>
+        <w:rPr>
+          <w:rFonts w:eastAsiaTheme="minorEastAsia"/>
+        </w:rPr>
+        <w:t>the</w:t>
+      </w:r>
+      <w:r>
+        <w:rPr>
+          <w:rFonts w:eastAsiaTheme="minorEastAsia"/>
+        </w:rPr>
+        <w:t xml:space="preserve"> Change Vocabulary Textual Analysis, explained in the previous section. </w:t>
+      </w:r>
+      <w:r>
+        <w:rPr>
+          <w:rFonts w:eastAsiaTheme="minorEastAsia"/>
+        </w:rPr>
+        <w:t>We take the 'percentage use of change grams'</w:t>
+      </w:r>
+      <w:r>
+        <w:rPr>
+          <w:rFonts w:eastAsiaTheme="minorEastAsia"/>
+        </w:rPr>
+        <w:t xml:space="preserve"> resulting from the dictionary-based frequency analysis, and derive a relative scoring as follows:</w:t>
+      </w:r>
+    </w:p>
+    <w:p>
+      <w:pPr>
+        <w:rPr>
+          <w:rFonts w:eastAsiaTheme="minorEastAsia"/>
+        </w:rPr>
+      </w:pPr>
+    </w:p>
+    <w:p>
+      <w:pPr>
+        <w:rPr>
+          <w:rFonts w:eastAsiaTheme="minorEastAsia"/>
+        </w:rPr>
+      </w:pPr>
+      <w:r>
+        <w:rPr>
+          <w:rFonts w:eastAsiaTheme="minorEastAsia"/>
+        </w:rPr>
+        <w:t xml:space="preserve">For each presidential general race (ie: post-primaries), </w:t>
+      </w:r>
       <w:proofErr w:type="spellStart"/>
       <w:r>
-        <w:t>asdasd</w:t>
+        <w:rPr>
+          <w:rFonts w:eastAsiaTheme="minorEastAsia"/>
+        </w:rPr>
+        <w:t>i</w:t>
       </w:r>
       <w:proofErr w:type="spellEnd"/>
     </w:p>
+    <w:p>
+      <w:pPr>
+        <w:rPr>
+          <w:rFonts w:eastAsiaTheme="minorEastAsia"/>
+        </w:rPr>
+      </w:pPr>
+      <w:r>
+        <w:rPr>
+          <w:rFonts w:eastAsiaTheme="minorEastAsia"/>
+        </w:rPr>
+        <w:t>For each year</w:t>
+      </w:r>
+    </w:p>
+    <w:p>
+      <w:pPr>
+        <w:rPr>
+          <w:rFonts w:eastAsiaTheme="minorEastAsia"/>
+        </w:rPr>
+      </w:pPr>
+      <w:r>
+        <w:rPr>
+          <w:rFonts w:eastAsiaTheme="minorEastAsia"/>
+        </w:rPr>
+        <w:t>For nominees</w:t>
+      </w:r>
+    </w:p>
+    <w:p>
+      <w:pPr>
+        <w:rPr>
+          <w:rFonts w:eastAsiaTheme="minorEastAsia"/>
+        </w:rPr>
+      </w:pPr>
+      <w:r>
+        <w:rPr>
+          <w:rFonts w:eastAsiaTheme="minorEastAsia"/>
+        </w:rPr>
+        <w:t>Find top change speaker, take the %</w:t>
+      </w:r>
+    </w:p>
+    <w:p>
+      <w:pPr>
+        <w:rPr>
+          <w:rFonts w:eastAsiaTheme="minorEastAsia"/>
+        </w:rPr>
+      </w:pPr>
+      <w:r>
+        <w:rPr>
+          <w:rFonts w:eastAsiaTheme="minorEastAsia"/>
+        </w:rPr>
+        <w:t xml:space="preserve">Divide all other speaker % by this % to arrive at </w:t>
+      </w:r>
+      <w:proofErr w:type="gramStart"/>
+      <w:r>
+        <w:rPr>
+          <w:rFonts w:eastAsiaTheme="minorEastAsia"/>
+        </w:rPr>
+        <w:t>their</w:t>
+      </w:r>
+      <w:proofErr w:type="gramEnd"/>
+    </w:p>
+    <w:p>
+      <w:pPr>
+        <w:rPr>
+          <w:rFonts w:eastAsiaTheme="minorEastAsia"/>
+        </w:rPr>
+      </w:pPr>
+      <w:r>
+        <w:rPr>
+          <w:rFonts w:eastAsiaTheme="minorEastAsia"/>
+        </w:rPr>
+        <w:t>'</w:t>
+      </w:r>
+      <w:proofErr w:type="spellStart"/>
+      <w:proofErr w:type="gramStart"/>
+      <w:r>
+        <w:rPr>
+          <w:rFonts w:eastAsiaTheme="minorEastAsia"/>
+        </w:rPr>
+        <w:t>relative</w:t>
+      </w:r>
+      <w:proofErr w:type="gramEnd"/>
+      <w:r>
+        <w:rPr>
+          <w:rFonts w:eastAsiaTheme="minorEastAsia"/>
+        </w:rPr>
+        <w:t>_inyear_changegrams</w:t>
+      </w:r>
+      <w:proofErr w:type="spellEnd"/>
+      <w:r>
+        <w:rPr>
+          <w:rFonts w:eastAsiaTheme="minorEastAsia"/>
+        </w:rPr>
+        <w:t>'</w:t>
+      </w:r>
+      <w:r>
+        <w:rPr>
+          <w:rFonts w:eastAsiaTheme="minorEastAsia"/>
+        </w:rPr>
+        <w:t xml:space="preserve"> </w:t>
+      </w:r>
+    </w:p>
+    <w:p>
+      <w:pPr>
+        <w:rPr>
+          <w:rFonts w:eastAsiaTheme="minorEastAsia"/>
+        </w:rPr>
+      </w:pPr>
+    </w:p>
+    <w:p>
+      <w:pPr>
+        <w:rPr>
+          <w:rFonts w:eastAsiaTheme="minorEastAsia"/>
+        </w:rPr>
+      </w:pPr>
+      <w:r>
+        <w:rPr>
+          <w:rFonts w:eastAsiaTheme="minorEastAsia"/>
+        </w:rPr>
+        <w:t>The 'Attributes' aspect of a candidate</w:t>
+      </w:r>
+      <w:r>
+        <w:rPr>
+          <w:rFonts w:eastAsiaTheme="minorEastAsia"/>
+        </w:rPr>
+        <w:t xml:space="preserve"> is built as a combination of five variables</w:t>
+      </w:r>
+      <w:r>
+        <w:rPr>
+          <w:rFonts w:eastAsiaTheme="minorEastAsia"/>
+        </w:rPr>
+        <w:t xml:space="preserve">, being: </w:t>
+      </w:r>
+    </w:p>
+    <w:p>
+      <w:pPr>
+        <w:rPr>
+          <w:rFonts w:eastAsiaTheme="minorEastAsia"/>
+        </w:rPr>
+      </w:pPr>
+      <w:r>
+        <w:rPr>
+          <w:rFonts w:eastAsiaTheme="minorEastAsia"/>
+        </w:rPr>
+        <w:t>A) Visible Minority</w:t>
+      </w:r>
+      <w:r>
+        <w:rPr>
+          <w:rFonts w:eastAsiaTheme="minorEastAsia"/>
+        </w:rPr>
+        <w:t xml:space="preserve"> - coded as 0 if the candidate is of 'white' descent, 1 otherwise</w:t>
+      </w:r>
+    </w:p>
+    <w:p>
+      <w:pPr>
+        <w:rPr>
+          <w:rFonts w:eastAsiaTheme="minorEastAsia"/>
+        </w:rPr>
+      </w:pPr>
+      <w:r>
+        <w:rPr>
+          <w:rFonts w:eastAsiaTheme="minorEastAsia"/>
+        </w:rPr>
+        <w:t>B) Gender</w:t>
+      </w:r>
+      <w:r>
+        <w:rPr>
+          <w:rFonts w:eastAsiaTheme="minorEastAsia"/>
+        </w:rPr>
+        <w:t xml:space="preserve"> - coded as </w:t>
+      </w:r>
+      <w:r>
+        <w:rPr>
+          <w:rFonts w:eastAsiaTheme="minorEastAsia"/>
+        </w:rPr>
+        <w:t>0 if</w:t>
+      </w:r>
+      <w:r>
+        <w:rPr>
+          <w:rFonts w:eastAsiaTheme="minorEastAsia"/>
+        </w:rPr>
+        <w:t xml:space="preserve"> the candidate is male, 1 otherwise</w:t>
+      </w:r>
+    </w:p>
+    <w:p>
+      <w:pPr>
+        <w:rPr>
+          <w:rFonts w:eastAsiaTheme="minorEastAsia"/>
+        </w:rPr>
+      </w:pPr>
+      <w:r>
+        <w:rPr>
+          <w:rFonts w:eastAsiaTheme="minorEastAsia"/>
+        </w:rPr>
+        <w:t xml:space="preserve">C) Age - </w:t>
+      </w:r>
+      <w:r>
+        <w:rPr>
+          <w:rFonts w:eastAsiaTheme="minorEastAsia"/>
+        </w:rPr>
+        <w:t>coded as the result of taking the candidate's age at the time of the election and passing it through the following transformation:</w:t>
+      </w:r>
+    </w:p>
+    <w:p>
+      <w:pPr>
+        <w:rPr>
+          <w:rFonts w:eastAsiaTheme="minorEastAsia"/>
+        </w:rPr>
+      </w:pPr>
+      <w:r>
+        <w:rPr>
+          <w:rFonts w:eastAsiaTheme="minorEastAsia"/>
+        </w:rPr>
+        <w:t xml:space="preserve">Age Score = </w:t>
+      </w:r>
+      <w:r>
+        <w:rPr>
+          <w:rFonts w:eastAsiaTheme="minorEastAsia"/>
+        </w:rPr>
+        <w:t>(</w:t>
+      </w:r>
+      <w:r>
+        <w:rPr>
+          <w:rFonts w:eastAsiaTheme="minorEastAsia"/>
+        </w:rPr>
+        <w:t>1-LOG((</w:t>
+      </w:r>
+      <w:r>
+        <w:rPr>
+          <w:rFonts w:eastAsiaTheme="minorEastAsia"/>
+        </w:rPr>
+        <w:t>AGE</w:t>
+      </w:r>
+      <w:r>
+        <w:rPr>
+          <w:rFonts w:eastAsiaTheme="minorEastAsia"/>
+        </w:rPr>
+        <w:t>-35)/100)</w:t>
+      </w:r>
+      <w:r>
+        <w:rPr>
+          <w:rFonts w:eastAsiaTheme="minorEastAsia"/>
+        </w:rPr>
+        <w:t>)</w:t>
+      </w:r>
+      <w:r>
+        <w:rPr>
+          <w:rFonts w:eastAsiaTheme="minorEastAsia"/>
+        </w:rPr>
+        <w:t>-1</w:t>
+      </w:r>
+      <w:r>
+        <w:rPr>
+          <w:rFonts w:eastAsiaTheme="minorEastAsia"/>
+        </w:rPr>
+        <w:t xml:space="preserve"> </w:t>
+      </w:r>
+      <w:r>
+        <w:rPr>
+          <w:rFonts w:eastAsiaTheme="minorEastAsia"/>
+          <w:highlight w:val="magenta"/>
+        </w:rPr>
+        <w:t xml:space="preserve">Breaks down </w:t>
+      </w:r>
+      <w:r>
+        <w:rPr>
+          <w:rFonts w:eastAsiaTheme="minorEastAsia"/>
+          <w:highlight w:val="magenta"/>
+        </w:rPr>
+        <w:t>easily. With 45 you get 1, with 36 you get 2. With 35 you get #NUM</w:t>
+      </w:r>
+      <w:r>
+        <w:rPr>
+          <w:rFonts w:eastAsiaTheme="minorEastAsia"/>
+        </w:rPr>
+        <w:t xml:space="preserve"> </w:t>
+      </w:r>
+    </w:p>
+    <w:p>
+      <w:pPr>
+        <w:rPr>
+          <w:rFonts w:eastAsiaTheme="minorEastAsia"/>
+        </w:rPr>
+      </w:pPr>
+      <w:r>
+        <w:rPr>
+          <w:rFonts w:eastAsiaTheme="minorEastAsia"/>
+        </w:rPr>
+        <w:t xml:space="preserve">Which subtracts the mandatory minimum age for candidacy (35) from the candidate's age on September 1st of the election year for which the score is being calculated, divides the result by 100, and takes the Logarithm of the result. </w:t>
+      </w:r>
+      <w:r>
+        <w:rPr>
+          <w:rFonts w:eastAsiaTheme="minorEastAsia"/>
+        </w:rPr>
+        <w:t>This value</w:t>
+      </w:r>
+      <w:r>
+        <w:rPr>
+          <w:rFonts w:eastAsiaTheme="minorEastAsia"/>
+        </w:rPr>
+        <w:t xml:space="preserve"> is then subtracted from 1 to give our score the correct direction (ie: a younger candidate means more change, so the 'direction' has to be changed so that a lower age gives a higher score). Finally, 1 is subtracted from the result to ensure that values remain in the range [0,1].</w:t>
+      </w:r>
+    </w:p>
+    <w:p>
+      <w:pPr>
+        <w:rPr>
+          <w:rFonts w:eastAsiaTheme="minorEastAsia"/>
+        </w:rPr>
+      </w:pPr>
+      <w:r>
+        <w:rPr>
+          <w:rFonts w:eastAsiaTheme="minorEastAsia"/>
+        </w:rPr>
+        <w:t xml:space="preserve">D) </w:t>
+      </w:r>
+      <w:r>
+        <w:rPr>
+          <w:rFonts w:eastAsiaTheme="minorEastAsia"/>
+        </w:rPr>
+        <w:t>Belongs to Political Dynasty - coded as 0 if anyone in the candidate's immediate family (ie: sharing a surname) has held the office of the president before</w:t>
+      </w:r>
+    </w:p>
+    <w:p>
+      <w:pPr>
+        <w:rPr>
+          <w:rFonts w:eastAsiaTheme="minorEastAsia"/>
+        </w:rPr>
+      </w:pPr>
+      <w:r>
+        <w:rPr>
+          <w:rFonts w:eastAsiaTheme="minorEastAsia"/>
+        </w:rPr>
+        <w:t>E) High Governmental Office - coded as 0 if the candidate has been President, 0.2 is the candidate has held a presidential cabinet position (Vice President, Secretary of State...)</w:t>
+      </w:r>
+      <w:r>
+        <w:rPr>
+          <w:rFonts w:eastAsiaTheme="minorEastAsia"/>
+        </w:rPr>
+        <w:t>, 0.4 if the candidate has been a Governor or Senator, and 1 otherwise</w:t>
+      </w:r>
+    </w:p>
+    <w:p>
+      <w:pPr>
+        <w:rPr>
+          <w:rFonts w:eastAsiaTheme="minorEastAsia"/>
+        </w:rPr>
+      </w:pPr>
+    </w:p>
+    <w:p>
+      <w:pPr>
+        <w:rPr>
+          <w:rFonts w:eastAsiaTheme="minorEastAsia"/>
+        </w:rPr>
+      </w:pPr>
+      <w:r>
+        <w:rPr>
+          <w:rFonts w:eastAsiaTheme="minorEastAsia"/>
+        </w:rPr>
+        <w:t>a combination of static and semi-static personal traits</w:t>
+      </w:r>
+    </w:p>
+    <w:p>
+      <w:pPr>
+        <w:rPr>
+          <w:rFonts w:eastAsiaTheme="minorEastAsia"/>
+        </w:rPr>
+      </w:pPr>
+    </w:p>
+    <w:p>
+      <w:pPr>
+        <w:rPr>
+          <w:rFonts w:eastAsiaTheme="minorEastAsia"/>
+        </w:rPr>
+      </w:pPr>
+    </w:p>
+    <w:p>
+      <w:pPr>
+        <w:rPr>
+          <w:rFonts w:eastAsiaTheme="minorEastAsia"/>
+        </w:rPr>
+      </w:pPr>
+      <w:r>
+        <w:t xml:space="preserve">In practice, the CI represents a weighted summation of each of the component variables. For variables </w:t>
+      </w:r>
+      <w:r>
+        <w:rPr>
+          <w:i/>
+          <w:iCs/>
+        </w:rPr>
+        <w:t>v1, v2, v</w:t>
+      </w:r>
+      <w:proofErr w:type="gramStart"/>
+      <w:r>
+        <w:rPr>
+          <w:i/>
+          <w:iCs/>
+        </w:rPr>
+        <w:t>3,...</w:t>
+      </w:r>
+      <w:proofErr w:type="spellStart"/>
+      <w:proofErr w:type="gramEnd"/>
+      <w:r>
+        <w:rPr>
+          <w:i/>
+          <w:iCs/>
+        </w:rPr>
+        <w:t>vk</w:t>
+      </w:r>
+      <w:proofErr w:type="spellEnd"/>
+      <w:r>
+        <w:t xml:space="preserve">, we have respective weights </w:t>
+      </w:r>
+      <w:r>
+        <w:rPr>
+          <w:i/>
+          <w:iCs/>
+        </w:rPr>
+        <w:t>w1, w2, w3,...</w:t>
+      </w:r>
+      <w:proofErr w:type="spellStart"/>
+      <w:r>
+        <w:rPr>
+          <w:i/>
+          <w:iCs/>
+        </w:rPr>
+        <w:t>wk</w:t>
+      </w:r>
+      <w:proofErr w:type="spellEnd"/>
+      <w:r>
+        <w:t xml:space="preserve">, </w:t>
+      </w:r>
+      <w:r>
+        <w:rPr>
+          <w:rFonts w:eastAsiaTheme="minorEastAsia"/>
+        </w:rPr>
+        <w:t xml:space="preserve">where the sum of weights </w:t>
+      </w:r>
+      <w:r>
+        <w:rPr>
+          <w:rFonts w:eastAsiaTheme="minorEastAsia"/>
+        </w:rPr>
+        <w:lastRenderedPageBreak/>
+        <w:t>(</w:t>
+      </w:r>
+      <w:r>
+        <w:rPr>
+          <w:i/>
+          <w:iCs/>
+        </w:rPr>
+        <w:t>w1+w2+w3+...</w:t>
+      </w:r>
+      <w:proofErr w:type="spellStart"/>
+      <w:r>
+        <w:rPr>
+          <w:i/>
+          <w:iCs/>
+        </w:rPr>
+        <w:t>wk</w:t>
+      </w:r>
+      <w:proofErr w:type="spellEnd"/>
+      <w:r>
+        <w:t>)</w:t>
+      </w:r>
+      <w:r>
+        <w:t xml:space="preserve"> = 1. This weighted sum is formally denoted as </w:t>
+      </w:r>
+      <w:r>
+        <w:rPr>
+          <w:i/>
+          <w:iCs/>
+        </w:rPr>
+        <w:t>Weighted Sum</w:t>
+      </w:r>
+      <w:r>
+        <w:t xml:space="preserve"> = </w:t>
+      </w:r>
+      <m:oMath>
+        <m:nary>
+          <m:naryPr>
+            <m:chr m:val="∑"/>
+            <m:limLoc m:val="undOvr"/>
+            <m:ctrlPr>
+              <w:rPr>
+                <w:rFonts w:ascii="Cambria Math" w:hAnsi="Cambria Math"/>
+                <w:i/>
+              </w:rPr>
+            </m:ctrlPr>
+          </m:naryPr>
+          <m:sub>
+            <m:r>
+              <w:rPr>
+                <w:rFonts w:ascii="Cambria Math" w:hAnsi="Cambria Math"/>
+              </w:rPr>
+              <m:t>i=1</m:t>
+            </m:r>
+          </m:sub>
+          <m:sup>
+            <m:r>
+              <w:rPr>
+                <w:rFonts w:ascii="Cambria Math" w:hAnsi="Cambria Math"/>
+              </w:rPr>
+              <m:t>k</m:t>
+            </m:r>
+          </m:sup>
+          <m:e>
+            <m:r>
+              <w:rPr>
+                <w:rFonts w:ascii="Cambria Math" w:hAnsi="Cambria Math"/>
+              </w:rPr>
+              <m:t>(</m:t>
+            </m:r>
+            <m:sSub>
+              <m:sSubPr>
+                <m:ctrlPr>
+                  <w:rPr>
+                    <w:rFonts w:ascii="Cambria Math" w:hAnsi="Cambria Math"/>
+                    <w:i/>
+                  </w:rPr>
+                </m:ctrlPr>
+              </m:sSubPr>
+              <m:e>
+                <m:r>
+                  <w:rPr>
+                    <w:rFonts w:ascii="Cambria Math" w:hAnsi="Cambria Math"/>
+                  </w:rPr>
+                  <m:t>v</m:t>
+                </m:r>
+              </m:e>
+              <m:sub>
+                <m:r>
+                  <w:rPr>
+                    <w:rFonts w:ascii="Cambria Math" w:hAnsi="Cambria Math"/>
+                  </w:rPr>
+                  <m:t>i</m:t>
+                </m:r>
+              </m:sub>
+            </m:sSub>
+            <m:r>
+              <w:rPr>
+                <w:rFonts w:ascii="Cambria Math" w:hAnsi="Cambria Math"/>
+              </w:rPr>
+              <m:t>×</m:t>
+            </m:r>
+            <m:sSub>
+              <m:sSubPr>
+                <m:ctrlPr>
+                  <w:rPr>
+                    <w:rFonts w:ascii="Cambria Math" w:hAnsi="Cambria Math"/>
+                    <w:i/>
+                  </w:rPr>
+                </m:ctrlPr>
+              </m:sSubPr>
+              <m:e>
+                <m:r>
+                  <w:rPr>
+                    <w:rFonts w:ascii="Cambria Math" w:hAnsi="Cambria Math"/>
+                  </w:rPr>
+                  <m:t>w</m:t>
+                </m:r>
+              </m:e>
+              <m:sub>
+                <m:r>
+                  <w:rPr>
+                    <w:rFonts w:ascii="Cambria Math" w:hAnsi="Cambria Math"/>
+                  </w:rPr>
+                  <m:t>i</m:t>
+                </m:r>
+              </m:sub>
+            </m:sSub>
+            <m:r>
+              <w:rPr>
+                <w:rFonts w:ascii="Cambria Math" w:hAnsi="Cambria Math"/>
+              </w:rPr>
+              <m:t>)</m:t>
+            </m:r>
+          </m:e>
+        </m:nary>
+      </m:oMath>
+      <w:r>
+        <w:rPr>
+          <w:rFonts w:eastAsiaTheme="minorEastAsia"/>
+        </w:rPr>
+        <w:t>.</w:t>
+      </w:r>
+    </w:p>
+    <w:p>
+      <w:pPr>
+        <w:rPr>
+          <w:rFonts w:eastAsiaTheme="minorEastAsia"/>
+        </w:rPr>
+      </w:pPr>
+      <w:r>
+        <w:rPr>
+          <w:rFonts w:eastAsiaTheme="minorEastAsia"/>
+        </w:rPr>
+        <w:br/>
+      </w:r>
+    </w:p>
+    <w:p/>
     <w:p/>
     <w:p>
       <w:pPr>
@@ -3432,13 +4315,51 @@
         <w:ind w:firstLine="480"/>
       </w:pPr>
     </w:p>
-    <w:p/>
+    <w:p>
+      <w:pPr>
+        <w:ind w:firstLine="240"/>
+      </w:pPr>
+    </w:p>
+    <w:p>
+      <w:pPr>
+        <w:ind w:firstLine="240"/>
+      </w:pPr>
+    </w:p>
+    <w:p>
+      <w:pPr>
+        <w:ind w:firstLine="240"/>
+      </w:pPr>
+      <w:r>
+        <w:t xml:space="preserve">Study Two - Change </w:t>
+      </w:r>
+      <w:r>
+        <w:t>Voter</w:t>
+      </w:r>
+      <w:r>
+        <w:t xml:space="preserve"> Identification </w:t>
+      </w:r>
+    </w:p>
     <w:p>
       <w:pPr>
         <w:pStyle w:val="TOC2"/>
         <w:spacing w:line="240" w:lineRule="auto"/>
         <w:ind w:firstLine="480"/>
       </w:pPr>
+      <w:r>
+        <w:t>5.3</w:t>
+      </w:r>
+      <w:r>
+        <w:t xml:space="preserve"> </w:t>
+      </w:r>
+      <w:r>
+        <w:t xml:space="preserve">Change Voter Identification Analysis </w:t>
+      </w:r>
+      <w:r>
+        <w:ptab w:relativeTo="margin" w:alignment="right" w:leader="dot"/>
+      </w:r>
+      <w:r>
+        <w:t xml:space="preserve"> 5</w:t>
+      </w:r>
     </w:p>
     <w:p>
       <w:pPr>
@@ -3447,25 +4368,16 @@
         <w:ind w:firstLine="480"/>
       </w:pPr>
       <w:r>
-        <w:t>5</w:t>
-      </w:r>
-      <w:r>
-        <w:t>.</w:t>
-      </w:r>
-      <w:r>
-        <w:t>2</w:t>
-      </w:r>
-      <w:r>
-        <w:t xml:space="preserve"> </w:t>
-      </w:r>
-      <w:r>
-        <w:t>Composite Index</w:t>
-      </w:r>
-      <w:r>
-        <w:t xml:space="preserve"> </w:t>
-      </w:r>
-      <w:r>
-        <w:t>of Change</w:t>
+        <w:t>5.4</w:t>
+      </w:r>
+      <w:r>
+        <w:t xml:space="preserve"> </w:t>
+      </w:r>
+      <w:r>
+        <w:t>Change Voter Distributional Independence Testing</w:t>
+      </w:r>
+      <w:r>
+        <w:t xml:space="preserve"> </w:t>
       </w:r>
       <w:r>
         <w:ptab w:relativeTo="margin" w:alignment="right" w:leader="dot"/>
@@ -3476,16 +4388,234 @@
     </w:p>
     <w:p>
       <w:pPr>
+        <w:rPr>
+          <w:b/>
+          <w:bCs/>
+        </w:rPr>
+      </w:pPr>
+    </w:p>
+    <w:p>
+      <w:pPr>
+        <w:rPr>
+          <w:b/>
+          <w:bCs/>
+        </w:rPr>
+      </w:pPr>
+    </w:p>
+    <w:p/>
+    <w:p>
+      <w:pPr>
+        <w:rPr>
+          <w:sz w:val="28"/>
+          <w:szCs w:val="28"/>
+        </w:rPr>
+      </w:pPr>
+    </w:p>
+    <w:p>
+      <w:pPr>
+        <w:rPr>
+          <w:sz w:val="28"/>
+          <w:szCs w:val="28"/>
+        </w:rPr>
+      </w:pPr>
+    </w:p>
+    <w:p>
+      <w:pPr>
+        <w:rPr>
+          <w:sz w:val="28"/>
+          <w:szCs w:val="28"/>
+        </w:rPr>
+      </w:pPr>
+    </w:p>
+    <w:p>
+      <w:pPr>
+        <w:rPr>
+          <w:sz w:val="28"/>
+          <w:szCs w:val="28"/>
+        </w:rPr>
+      </w:pPr>
+    </w:p>
+    <w:p>
+      <w:pPr>
+        <w:rPr>
+          <w:sz w:val="28"/>
+          <w:szCs w:val="28"/>
+        </w:rPr>
+      </w:pPr>
+    </w:p>
+    <w:p>
+      <w:pPr>
+        <w:rPr>
+          <w:sz w:val="28"/>
+          <w:szCs w:val="28"/>
+        </w:rPr>
+      </w:pPr>
+    </w:p>
+    <w:p>
+      <w:pPr>
+        <w:rPr>
+          <w:sz w:val="28"/>
+          <w:szCs w:val="28"/>
+        </w:rPr>
+      </w:pPr>
+    </w:p>
+    <w:p>
+      <w:pPr>
+        <w:rPr>
+          <w:sz w:val="28"/>
+          <w:szCs w:val="28"/>
+        </w:rPr>
+      </w:pPr>
+    </w:p>
+    <w:p>
+      <w:pPr>
+        <w:rPr>
+          <w:sz w:val="28"/>
+          <w:szCs w:val="28"/>
+        </w:rPr>
+      </w:pPr>
+    </w:p>
+    <w:p>
+      <w:pPr>
+        <w:rPr>
+          <w:sz w:val="28"/>
+          <w:szCs w:val="28"/>
+        </w:rPr>
+      </w:pPr>
+    </w:p>
+    <w:p>
+      <w:pPr>
+        <w:rPr>
+          <w:sz w:val="28"/>
+          <w:szCs w:val="28"/>
+        </w:rPr>
+      </w:pPr>
+    </w:p>
+    <w:p>
+      <w:pPr>
+        <w:rPr>
+          <w:sz w:val="28"/>
+          <w:szCs w:val="28"/>
+        </w:rPr>
+      </w:pPr>
+    </w:p>
+    <w:p>
+      <w:pPr>
+        <w:rPr>
+          <w:sz w:val="28"/>
+          <w:szCs w:val="28"/>
+        </w:rPr>
+      </w:pPr>
+    </w:p>
+    <w:p>
+      <w:pPr>
+        <w:rPr>
+          <w:sz w:val="28"/>
+          <w:szCs w:val="28"/>
+        </w:rPr>
+      </w:pPr>
+    </w:p>
+    <w:p>
+      <w:pPr>
+        <w:rPr>
+          <w:sz w:val="28"/>
+          <w:szCs w:val="28"/>
+        </w:rPr>
+      </w:pPr>
+    </w:p>
+    <w:p>
+      <w:pPr>
+        <w:rPr>
+          <w:sz w:val="28"/>
+          <w:szCs w:val="28"/>
+        </w:rPr>
+      </w:pPr>
+    </w:p>
+    <w:p>
+      <w:pPr>
+        <w:rPr>
+          <w:sz w:val="28"/>
+          <w:szCs w:val="28"/>
+        </w:rPr>
+      </w:pPr>
+    </w:p>
+    <w:p>
+      <w:pPr>
+        <w:rPr>
+          <w:sz w:val="28"/>
+          <w:szCs w:val="28"/>
+        </w:rPr>
+      </w:pPr>
+    </w:p>
+    <w:p>
+      <w:pPr>
+        <w:rPr>
+          <w:sz w:val="28"/>
+          <w:szCs w:val="28"/>
+        </w:rPr>
+      </w:pPr>
+    </w:p>
+    <w:p>
+      <w:pPr>
+        <w:rPr>
+          <w:sz w:val="28"/>
+          <w:szCs w:val="28"/>
+        </w:rPr>
+      </w:pPr>
+    </w:p>
+    <w:p>
+      <w:pPr>
+        <w:rPr>
+          <w:sz w:val="28"/>
+          <w:szCs w:val="28"/>
+        </w:rPr>
+      </w:pPr>
+    </w:p>
+    <w:p>
+      <w:pPr>
+        <w:rPr>
+          <w:sz w:val="28"/>
+          <w:szCs w:val="28"/>
+        </w:rPr>
+      </w:pPr>
+    </w:p>
+    <w:p>
+      <w:pPr>
+        <w:rPr>
+          <w:sz w:val="28"/>
+          <w:szCs w:val="28"/>
+        </w:rPr>
+      </w:pPr>
+    </w:p>
+    <w:p>
+      <w:pPr>
+        <w:rPr>
+          <w:sz w:val="28"/>
+          <w:szCs w:val="28"/>
+        </w:rPr>
+      </w:pPr>
+    </w:p>
+    <w:p>
+      <w:pPr>
+        <w:rPr>
+          <w:sz w:val="28"/>
+          <w:szCs w:val="28"/>
+        </w:rPr>
+      </w:pPr>
+      <w:r>
+        <w:rPr>
+          <w:sz w:val="28"/>
+          <w:szCs w:val="28"/>
+        </w:rPr>
+        <w:t>Results</w:t>
+      </w:r>
+    </w:p>
+    <w:p>
+      <w:pPr>
         <w:ind w:firstLine="240"/>
       </w:pPr>
       <w:r>
-        <w:t xml:space="preserve">Study Two - Change </w:t>
-      </w:r>
-      <w:r>
-        <w:t>Voter</w:t>
-      </w:r>
-      <w:r>
-        <w:t xml:space="preserve"> Identification </w:t>
+        <w:t xml:space="preserve">Study One - Change Candidate Identification </w:t>
       </w:r>
     </w:p>
     <w:p>
@@ -3495,13 +4625,13 @@
         <w:ind w:firstLine="480"/>
       </w:pPr>
       <w:r>
-        <w:t>5.3</w:t>
-      </w:r>
-      <w:r>
-        <w:t xml:space="preserve"> </w:t>
-      </w:r>
-      <w:r>
-        <w:t xml:space="preserve">Change Voter Identification Analysis </w:t>
+        <w:t>6</w:t>
+      </w:r>
+      <w:r>
+        <w:t xml:space="preserve">.1 </w:t>
+      </w:r>
+      <w:r>
+        <w:t xml:space="preserve">Candidate of Change, Text-Based </w:t>
       </w:r>
       <w:r>
         <w:ptab w:relativeTo="margin" w:alignment="right" w:leader="dot"/>
@@ -3517,16 +4647,20 @@
         <w:ind w:firstLine="480"/>
       </w:pPr>
       <w:r>
-        <w:t>5.4</w:t>
-      </w:r>
-      <w:r>
-        <w:t xml:space="preserve"> </w:t>
-      </w:r>
-      <w:r>
-        <w:t>Change Voter Distributional Independence Testing</w:t>
-      </w:r>
-      <w:r>
-        <w:t xml:space="preserve"> </w:t>
+        <w:lastRenderedPageBreak/>
+        <w:t>6</w:t>
+      </w:r>
+      <w:r>
+        <w:t>.</w:t>
+      </w:r>
+      <w:r>
+        <w:t>2</w:t>
+      </w:r>
+      <w:r>
+        <w:t xml:space="preserve"> </w:t>
+      </w:r>
+      <w:r>
+        <w:t xml:space="preserve">Candidate of Change, Indicator-Based </w:t>
       </w:r>
       <w:r>
         <w:ptab w:relativeTo="margin" w:alignment="right" w:leader="dot"/>
@@ -3535,259 +4669,251 @@
         <w:t xml:space="preserve"> 5</w:t>
       </w:r>
     </w:p>
-    <w:p>
-      <w:pPr>
-        <w:rPr>
-          <w:b/>
-          <w:bCs/>
-        </w:rPr>
-      </w:pPr>
-    </w:p>
-    <w:p>
-      <w:pPr>
-        <w:rPr>
-          <w:b/>
-          <w:bCs/>
-        </w:rPr>
-      </w:pPr>
-    </w:p>
-    <w:p/>
-    <w:p>
-      <w:pPr>
-        <w:rPr>
-          <w:sz w:val="28"/>
-          <w:szCs w:val="28"/>
-        </w:rPr>
-      </w:pPr>
-    </w:p>
-    <w:p>
-      <w:pPr>
-        <w:rPr>
-          <w:sz w:val="28"/>
-          <w:szCs w:val="28"/>
-        </w:rPr>
-      </w:pPr>
-    </w:p>
-    <w:p>
-      <w:pPr>
-        <w:rPr>
-          <w:sz w:val="28"/>
-          <w:szCs w:val="28"/>
-        </w:rPr>
-      </w:pPr>
-    </w:p>
-    <w:p>
-      <w:pPr>
-        <w:rPr>
-          <w:sz w:val="28"/>
-          <w:szCs w:val="28"/>
-        </w:rPr>
-      </w:pPr>
-    </w:p>
-    <w:p>
-      <w:pPr>
-        <w:rPr>
-          <w:sz w:val="28"/>
-          <w:szCs w:val="28"/>
-        </w:rPr>
-      </w:pPr>
-    </w:p>
-    <w:p>
-      <w:pPr>
-        <w:rPr>
-          <w:sz w:val="28"/>
-          <w:szCs w:val="28"/>
-        </w:rPr>
-      </w:pPr>
-    </w:p>
-    <w:p>
-      <w:pPr>
-        <w:rPr>
-          <w:sz w:val="28"/>
-          <w:szCs w:val="28"/>
-        </w:rPr>
-      </w:pPr>
-    </w:p>
-    <w:p>
-      <w:pPr>
-        <w:rPr>
-          <w:sz w:val="28"/>
-          <w:szCs w:val="28"/>
-        </w:rPr>
-      </w:pPr>
-    </w:p>
-    <w:p>
-      <w:pPr>
-        <w:rPr>
-          <w:sz w:val="28"/>
-          <w:szCs w:val="28"/>
-        </w:rPr>
-      </w:pPr>
-    </w:p>
-    <w:p>
-      <w:pPr>
-        <w:rPr>
-          <w:sz w:val="28"/>
-          <w:szCs w:val="28"/>
-        </w:rPr>
-      </w:pPr>
-    </w:p>
-    <w:p>
-      <w:pPr>
-        <w:rPr>
-          <w:sz w:val="28"/>
-          <w:szCs w:val="28"/>
-        </w:rPr>
-      </w:pPr>
-    </w:p>
-    <w:p>
-      <w:pPr>
-        <w:rPr>
-          <w:sz w:val="28"/>
-          <w:szCs w:val="28"/>
-        </w:rPr>
-      </w:pPr>
-    </w:p>
-    <w:p>
-      <w:pPr>
-        <w:rPr>
-          <w:sz w:val="28"/>
-          <w:szCs w:val="28"/>
-        </w:rPr>
-      </w:pPr>
-    </w:p>
-    <w:p>
-      <w:pPr>
-        <w:rPr>
-          <w:sz w:val="28"/>
-          <w:szCs w:val="28"/>
-        </w:rPr>
-      </w:pPr>
-    </w:p>
-    <w:p>
-      <w:pPr>
-        <w:rPr>
-          <w:sz w:val="28"/>
-          <w:szCs w:val="28"/>
-        </w:rPr>
-      </w:pPr>
-    </w:p>
-    <w:p>
-      <w:pPr>
-        <w:rPr>
-          <w:sz w:val="28"/>
-          <w:szCs w:val="28"/>
-        </w:rPr>
-      </w:pPr>
-    </w:p>
-    <w:p>
-      <w:pPr>
-        <w:rPr>
-          <w:sz w:val="28"/>
-          <w:szCs w:val="28"/>
-        </w:rPr>
-      </w:pPr>
-    </w:p>
-    <w:p>
-      <w:pPr>
-        <w:rPr>
-          <w:sz w:val="28"/>
-          <w:szCs w:val="28"/>
-        </w:rPr>
-      </w:pPr>
-    </w:p>
-    <w:p>
-      <w:pPr>
-        <w:rPr>
-          <w:sz w:val="28"/>
-          <w:szCs w:val="28"/>
-        </w:rPr>
-      </w:pPr>
-    </w:p>
-    <w:p>
-      <w:pPr>
-        <w:rPr>
-          <w:sz w:val="28"/>
-          <w:szCs w:val="28"/>
-        </w:rPr>
-      </w:pPr>
-    </w:p>
-    <w:p>
-      <w:pPr>
-        <w:rPr>
-          <w:sz w:val="28"/>
-          <w:szCs w:val="28"/>
-        </w:rPr>
-      </w:pPr>
-    </w:p>
-    <w:p>
-      <w:pPr>
-        <w:rPr>
-          <w:sz w:val="28"/>
-          <w:szCs w:val="28"/>
-        </w:rPr>
-      </w:pPr>
-    </w:p>
-    <w:p>
-      <w:pPr>
-        <w:rPr>
-          <w:sz w:val="28"/>
-          <w:szCs w:val="28"/>
-        </w:rPr>
-      </w:pPr>
-    </w:p>
-    <w:p>
-      <w:pPr>
-        <w:rPr>
-          <w:sz w:val="28"/>
-          <w:szCs w:val="28"/>
-        </w:rPr>
-      </w:pPr>
-    </w:p>
-    <w:p>
-      <w:pPr>
-        <w:rPr>
-          <w:sz w:val="28"/>
-          <w:szCs w:val="28"/>
-        </w:rPr>
-      </w:pPr>
-      <w:r>
-        <w:rPr>
-          <w:sz w:val="28"/>
-          <w:szCs w:val="28"/>
-        </w:rPr>
-        <w:t>Results</w:t>
-      </w:r>
-    </w:p>
+    <w:p/>
+    <w:p/>
     <w:p>
       <w:pPr>
         <w:ind w:firstLine="240"/>
       </w:pPr>
-      <w:r>
-        <w:t xml:space="preserve">Study One - Change Candidate Identification </w:t>
-      </w:r>
-    </w:p>
+    </w:p>
+    <w:p>
+      <w:pPr>
+        <w:ind w:firstLine="240"/>
+      </w:pPr>
+    </w:p>
+    <w:p>
+      <w:pPr>
+        <w:rPr>
+          <w:b/>
+          <w:bCs/>
+        </w:rPr>
+      </w:pPr>
+      <w:r>
+        <w:rPr>
+          <w:b/>
+          <w:bCs/>
+        </w:rPr>
+        <w:t xml:space="preserve">Study Two - Change Voter Identification </w:t>
+      </w:r>
+    </w:p>
+    <w:p>
+      <w:pPr>
+        <w:pStyle w:val="TOC2"/>
+        <w:spacing w:line="240" w:lineRule="auto"/>
+        <w:ind w:left="0"/>
+      </w:pPr>
+      <w:r>
+        <w:rPr>
+          <w:b/>
+          <w:bCs/>
+        </w:rPr>
+        <w:t>6.3 Change Voter</w:t>
+      </w:r>
+      <w:r>
+        <w:rPr>
+          <w:b/>
+          <w:bCs/>
+        </w:rPr>
+        <w:t xml:space="preserve"> Identification</w:t>
+      </w:r>
+      <w:r>
+        <w:rPr>
+          <w:b/>
+          <w:bCs/>
+        </w:rPr>
+        <w:tab/>
+      </w:r>
+      <w:r>
+        <w:tab/>
+      </w:r>
+      <w:r>
+        <w:tab/>
+      </w:r>
+    </w:p>
+    <w:p>
+      <w:pPr>
+        <w:pStyle w:val="TOC2"/>
+        <w:spacing w:line="240" w:lineRule="auto"/>
+      </w:pPr>
+    </w:p>
+    <w:p/>
+    <w:p>
+      <w:r>
+        <w:t xml:space="preserve">As is noted in the methodology section, respondents in the 2020 round of surveys were asked not only whom they voted for in the 2020 election (Biden/Trump), but also to recall their voting history from 2016 (Trump/Clinton) and 2012 (Obama/ Romney). Using this line of questioning, and based off of the results of the Composite Change Index developed in Study One of this paper, a subset of respondents </w:t>
+      </w:r>
+      <w:proofErr w:type="gramStart"/>
+      <w:r>
+        <w:t>were</w:t>
+      </w:r>
+      <w:proofErr w:type="gramEnd"/>
+      <w:r>
+        <w:t xml:space="preserve"> selected on the basis of the voting pattern:</w:t>
+      </w:r>
+    </w:p>
+    <w:p/>
+    <w:p>
+      <w:pPr>
+        <w:jc w:val="center"/>
+      </w:pPr>
+      <w:r>
+        <w:t>(2012: Obama) -&gt; (2016: Trump) -&gt; (2020: Biden)</w:t>
+      </w:r>
+    </w:p>
+    <w:p/>
+    <w:p>
+      <w:r>
+        <w:t xml:space="preserve">Figure _____ below illustrates the effect on </w:t>
+      </w:r>
+      <w:r>
+        <w:t>dataset size as these filtering rules are applied. Importantly, it shows the percentage of respondents who voted at all in the 2020 election.</w:t>
+      </w:r>
+    </w:p>
+    <w:p>
+      <w:pPr>
+        <w:jc w:val="center"/>
+      </w:pPr>
+    </w:p>
+    <w:p>
+      <w:pPr>
+        <w:jc w:val="center"/>
+      </w:pPr>
+      <w:r>
+        <w:t>TABLE</w:t>
+      </w:r>
+    </w:p>
+    <w:p>
+      <w:pPr>
+        <w:jc w:val="center"/>
+      </w:pPr>
+    </w:p>
+    <w:p>
+      <w:r>
+        <w:t>The s</w:t>
+      </w:r>
+      <w:r>
+        <w:t xml:space="preserve">ubset of voters who voted in a pattern </w:t>
+      </w:r>
+      <w:r>
+        <w:t xml:space="preserve">consistent with </w:t>
+      </w:r>
+      <w:r>
+        <w:t>Change Candidate</w:t>
+      </w:r>
+      <w:r>
+        <w:t xml:space="preserve"> voting</w:t>
+      </w:r>
+      <w:r>
+        <w:t xml:space="preserve"> in each of the three elections, are henceforth referred to as C-Voters </w:t>
+      </w:r>
+      <w:r>
+        <w:t>(</w:t>
+      </w:r>
+      <w:r>
+        <w:t>for their pattern of 'Change</w:t>
+      </w:r>
+      <w:r>
+        <w:t xml:space="preserve"> </w:t>
+      </w:r>
+      <w:r>
+        <w:t>Voting'</w:t>
+      </w:r>
+      <w:r>
+        <w:t>)</w:t>
+      </w:r>
+      <w:r>
+        <w:t>.</w:t>
+      </w:r>
+      <w:r>
+        <w:t xml:space="preserve"> </w:t>
+      </w:r>
+      <w:r>
+        <w:t xml:space="preserve">Respondents who voted in 2020 but </w:t>
+      </w:r>
+      <w:r>
+        <w:t xml:space="preserve">did </w:t>
+      </w:r>
+      <w:r>
+        <w:rPr>
+          <w:i/>
+          <w:iCs/>
+        </w:rPr>
+        <w:t>not</w:t>
+      </w:r>
+      <w:r>
+        <w:t xml:space="preserve"> follow the pattern of Change Voting </w:t>
+      </w:r>
+      <w:r>
+        <w:t xml:space="preserve">in all of the 2012, 2016, </w:t>
+      </w:r>
+      <w:r>
+        <w:rPr>
+          <w:u w:val="single"/>
+        </w:rPr>
+        <w:t>and</w:t>
+      </w:r>
+      <w:r>
+        <w:t xml:space="preserve"> </w:t>
+      </w:r>
+      <w:r>
+        <w:t xml:space="preserve">2020 </w:t>
+      </w:r>
+      <w:r>
+        <w:t xml:space="preserve">elections </w:t>
+      </w:r>
+      <w:r>
+        <w:t>are</w:t>
+      </w:r>
+      <w:r>
+        <w:t xml:space="preserve"> henceforth referred to as M-Voters (for the fact that they are </w:t>
+      </w:r>
+      <w:r>
+        <w:t xml:space="preserve">a </w:t>
+      </w:r>
+      <w:r>
+        <w:t>'Mix</w:t>
+      </w:r>
+      <w:r>
+        <w:t>ed' group</w:t>
+      </w:r>
+      <w:r>
+        <w:t xml:space="preserve"> of </w:t>
+      </w:r>
+      <w:r>
+        <w:t>v</w:t>
+      </w:r>
+      <w:r>
+        <w:t>oters).</w:t>
+      </w:r>
+    </w:p>
+    <w:p/>
+    <w:p/>
+    <w:p/>
+    <w:p/>
+    <w:p/>
+    <w:p/>
+    <w:p/>
+    <w:p/>
+    <w:p/>
+    <w:p/>
+    <w:p/>
+    <w:p/>
+    <w:p/>
+    <w:p/>
+    <w:p/>
+    <w:p/>
+    <w:p/>
+    <w:p/>
+    <w:p/>
+    <w:p/>
+    <w:p/>
+    <w:p/>
+    <w:p/>
     <w:p>
       <w:pPr>
         <w:pStyle w:val="TOC2"/>
         <w:spacing w:line="240" w:lineRule="auto"/>
         <w:ind w:firstLine="480"/>
       </w:pPr>
-      <w:r>
-        <w:t>6</w:t>
-      </w:r>
-      <w:r>
-        <w:t xml:space="preserve">.1 </w:t>
-      </w:r>
-      <w:r>
-        <w:t xml:space="preserve">Candidate of Change, Text-Based </w:t>
-      </w:r>
-      <w:r>
-        <w:ptab w:relativeTo="margin" w:alignment="right" w:leader="dot"/>
-      </w:r>
-      <w:r>
-        <w:t xml:space="preserve"> 5</w:t>
-      </w:r>
     </w:p>
     <w:p>
       <w:pPr>
@@ -3796,280 +4922,6 @@
         <w:ind w:firstLine="480"/>
       </w:pPr>
       <w:r>
-        <w:t>6</w:t>
-      </w:r>
-      <w:r>
-        <w:t>.</w:t>
-      </w:r>
-      <w:r>
-        <w:t>2</w:t>
-      </w:r>
-      <w:r>
-        <w:t xml:space="preserve"> </w:t>
-      </w:r>
-      <w:r>
-        <w:t xml:space="preserve">Candidate of Change, Indicator-Based </w:t>
-      </w:r>
-      <w:r>
-        <w:ptab w:relativeTo="margin" w:alignment="right" w:leader="dot"/>
-      </w:r>
-      <w:r>
-        <w:t xml:space="preserve"> 5</w:t>
-      </w:r>
-    </w:p>
-    <w:p/>
-    <w:p/>
-    <w:p>
-      <w:pPr>
-        <w:ind w:firstLine="240"/>
-      </w:pPr>
-    </w:p>
-    <w:p>
-      <w:pPr>
-        <w:ind w:firstLine="240"/>
-      </w:pPr>
-    </w:p>
-    <w:p>
-      <w:pPr>
-        <w:rPr>
-          <w:b/>
-          <w:bCs/>
-        </w:rPr>
-      </w:pPr>
-      <w:r>
-        <w:rPr>
-          <w:b/>
-          <w:bCs/>
-        </w:rPr>
-        <w:t xml:space="preserve">Study Two - Change Voter Identification </w:t>
-      </w:r>
-    </w:p>
-    <w:p>
-      <w:pPr>
-        <w:pStyle w:val="TOC2"/>
-        <w:spacing w:line="240" w:lineRule="auto"/>
-        <w:ind w:left="0"/>
-      </w:pPr>
-      <w:r>
-        <w:rPr>
-          <w:b/>
-          <w:bCs/>
-        </w:rPr>
-        <w:t>6.3 Change Voter</w:t>
-      </w:r>
-      <w:r>
-        <w:rPr>
-          <w:b/>
-          <w:bCs/>
-        </w:rPr>
-        <w:t xml:space="preserve"> Identification</w:t>
-      </w:r>
-      <w:r>
-        <w:rPr>
-          <w:b/>
-          <w:bCs/>
-        </w:rPr>
-        <w:tab/>
-      </w:r>
-      <w:r>
-        <w:tab/>
-      </w:r>
-      <w:r>
-        <w:tab/>
-      </w:r>
-    </w:p>
-    <w:p>
-      <w:pPr>
-        <w:pStyle w:val="TOC2"/>
-        <w:spacing w:line="240" w:lineRule="auto"/>
-      </w:pPr>
-    </w:p>
-    <w:p/>
-    <w:p>
-      <w:r>
-        <w:t xml:space="preserve">As is noted in the methodology section, respondents in the 2020 round of surveys were asked not only whom they voted for in the 2020 election (Biden/Trump), but also to recall their voting history from 2016 (Trump/Clinton) and 2012 (Obama/ Romney). Using this line of questioning, and based off of the results of the Composite Change Index developed in Study One of this paper, a subset of respondents </w:t>
-      </w:r>
-      <w:proofErr w:type="gramStart"/>
-      <w:r>
-        <w:t>were</w:t>
-      </w:r>
-      <w:proofErr w:type="gramEnd"/>
-      <w:r>
-        <w:t xml:space="preserve"> selected on the basis of the voting pattern:</w:t>
-      </w:r>
-    </w:p>
-    <w:p/>
-    <w:p>
-      <w:pPr>
-        <w:jc w:val="center"/>
-      </w:pPr>
-      <w:r>
-        <w:t>(2012: Obama) -&gt; (2016: Trump) -&gt; (2020: Biden)</w:t>
-      </w:r>
-    </w:p>
-    <w:p/>
-    <w:p>
-      <w:r>
-        <w:t xml:space="preserve">Figure _____ below illustrates the effect on </w:t>
-      </w:r>
-      <w:r>
-        <w:t>dataset size as these filtering rules are applied. Importantly, it shows the percentage of respondents who voted at all in the 2020 election.</w:t>
-      </w:r>
-    </w:p>
-    <w:p>
-      <w:pPr>
-        <w:jc w:val="center"/>
-      </w:pPr>
-    </w:p>
-    <w:p>
-      <w:pPr>
-        <w:jc w:val="center"/>
-      </w:pPr>
-      <w:r>
-        <w:t>TABLE</w:t>
-      </w:r>
-    </w:p>
-    <w:p>
-      <w:pPr>
-        <w:jc w:val="center"/>
-      </w:pPr>
-    </w:p>
-    <w:p>
-      <w:r>
-        <w:t>The s</w:t>
-      </w:r>
-      <w:r>
-        <w:t xml:space="preserve">ubset of voters who voted in a pattern </w:t>
-      </w:r>
-      <w:r>
-        <w:t xml:space="preserve">consistent with </w:t>
-      </w:r>
-      <w:r>
-        <w:t>Change Candidate</w:t>
-      </w:r>
-      <w:r>
-        <w:t xml:space="preserve"> voting</w:t>
-      </w:r>
-      <w:r>
-        <w:t xml:space="preserve"> in each of the three elections, are henceforth referred to as C-Voters </w:t>
-      </w:r>
-      <w:r>
-        <w:t>(</w:t>
-      </w:r>
-      <w:r>
-        <w:t>for their pattern of 'Change</w:t>
-      </w:r>
-      <w:r>
-        <w:t xml:space="preserve"> </w:t>
-      </w:r>
-      <w:r>
-        <w:t>Voting'</w:t>
-      </w:r>
-      <w:r>
-        <w:t>)</w:t>
-      </w:r>
-      <w:r>
-        <w:t>.</w:t>
-      </w:r>
-      <w:r>
-        <w:t xml:space="preserve"> </w:t>
-      </w:r>
-      <w:r>
-        <w:t xml:space="preserve">Respondents who voted in 2020 but </w:t>
-      </w:r>
-      <w:r>
-        <w:t xml:space="preserve">did </w:t>
-      </w:r>
-      <w:r>
-        <w:rPr>
-          <w:i/>
-          <w:iCs/>
-        </w:rPr>
-        <w:t>not</w:t>
-      </w:r>
-      <w:r>
-        <w:t xml:space="preserve"> follow the pattern of Change Voting </w:t>
-      </w:r>
-      <w:r>
-        <w:t xml:space="preserve">in all of the 2012, 2016, </w:t>
-      </w:r>
-      <w:r>
-        <w:rPr>
-          <w:u w:val="single"/>
-        </w:rPr>
-        <w:t>and</w:t>
-      </w:r>
-      <w:r>
-        <w:t xml:space="preserve"> </w:t>
-      </w:r>
-      <w:r>
-        <w:t xml:space="preserve">2020 </w:t>
-      </w:r>
-      <w:r>
-        <w:t xml:space="preserve">elections </w:t>
-      </w:r>
-      <w:r>
-        <w:t>are</w:t>
-      </w:r>
-      <w:r>
-        <w:t xml:space="preserve"> henceforth referred to as M-Voters (for the fact that they are </w:t>
-      </w:r>
-      <w:r>
-        <w:t xml:space="preserve">a </w:t>
-      </w:r>
-      <w:r>
-        <w:t>'Mix</w:t>
-      </w:r>
-      <w:r>
-        <w:t>ed' group</w:t>
-      </w:r>
-      <w:r>
-        <w:t xml:space="preserve"> of </w:t>
-      </w:r>
-      <w:r>
-        <w:t>v</w:t>
-      </w:r>
-      <w:r>
-        <w:t>oters).</w:t>
-      </w:r>
-    </w:p>
-    <w:p/>
-    <w:p/>
-    <w:p/>
-    <w:p/>
-    <w:p/>
-    <w:p/>
-    <w:p/>
-    <w:p/>
-    <w:p/>
-    <w:p/>
-    <w:p/>
-    <w:p/>
-    <w:p/>
-    <w:p/>
-    <w:p/>
-    <w:p/>
-    <w:p/>
-    <w:p/>
-    <w:p/>
-    <w:p/>
-    <w:p/>
-    <w:p/>
-    <w:p/>
-    <w:p>
-      <w:pPr>
-        <w:pStyle w:val="TOC2"/>
-        <w:spacing w:line="240" w:lineRule="auto"/>
-        <w:ind w:firstLine="480"/>
-      </w:pPr>
-    </w:p>
-    <w:p>
-      <w:pPr>
-        <w:pStyle w:val="TOC2"/>
-        <w:spacing w:line="240" w:lineRule="auto"/>
-        <w:ind w:firstLine="480"/>
-      </w:pPr>
-      <w:r>
         <w:t>6.4</w:t>
       </w:r>
       <w:r>
@@ -4199,7 +5051,6 @@
     </w:p>
     <w:p>
       <w:r>
-        <w:lastRenderedPageBreak/>
         <w:t>Each of which approaches the question of probability and distributional summarization from a different point of view.</w:t>
       </w:r>
     </w:p>
@@ -5116,6 +5967,58 @@
       <w:proofErr w:type="gramEnd"/>
       <w:r>
         <w:t xml:space="preserve"> further discussed in the methods section.</w:t>
+      </w:r>
+    </w:p>
+  </w:footnote>
+  <w:footnote w:id="2">
+    <w:p>
+      <w:pPr>
+        <w:pStyle w:val="FootnoteText"/>
+      </w:pPr>
+      <w:r>
+        <w:rPr>
+          <w:rStyle w:val="FootnoteReference"/>
+        </w:rPr>
+        <w:footnoteRef/>
+      </w:r>
+      <w:r>
+        <w:t xml:space="preserve"> 'Stemming' in the context of Text Analysis typically means shortening a word to its basic character stem. For example, "innovation" and "innovate" are both shortened to become the same stem, "innovat". Distinct from Lemmatization, Stemming does not aim to find the 'Lemma' or </w:t>
+      </w:r>
+      <w:r>
+        <w:t>'correct base word' (such as "swim" for "swimming"), but instead the shortest character version of the word that retains unique spelling across all other stems.</w:t>
+      </w:r>
+    </w:p>
+  </w:footnote>
+  <w:footnote w:id="3">
+    <w:p>
+      <w:pPr>
+        <w:pStyle w:val="FootnoteText"/>
+      </w:pPr>
+      <w:r>
+        <w:rPr>
+          <w:rStyle w:val="FootnoteReference"/>
+        </w:rPr>
+        <w:footnoteRef/>
+      </w:r>
+      <w:r>
+        <w:t xml:space="preserve"> </w:t>
+      </w:r>
+      <w:proofErr w:type="gramStart"/>
+      <w:r>
+        <w:t>Uni-Grams</w:t>
+      </w:r>
+      <w:proofErr w:type="gramEnd"/>
+      <w:r>
+        <w:t xml:space="preserve"> being single-word objects ("forward", "establishment"</w:t>
+      </w:r>
+      <w:r>
+        <w:t>)</w:t>
+      </w:r>
+      <w:r>
+        <w:t>, as opposed to Bi-Grams ("looking forward"), Tri-Grams ("drain the swamp")</w:t>
+      </w:r>
+      <w:r>
+        <w:t>, or N-Grams for any number N.</w:t>
       </w:r>
     </w:p>
   </w:footnote>

</xml_diff>

<commit_message>
Theory of Voter almost done
</commit_message>
<xml_diff>
--- a/Thesis Assets/Thesis Proto Thesis.docx
+++ b/Thesis Assets/Thesis Proto Thesis.docx
@@ -706,7 +706,6 @@
     <w:p/>
     <w:p>
       <w:pPr>
-        <w:jc w:val="center"/>
         <w:rPr>
           <w:b/>
           <w:bCs/>
@@ -1926,7 +1925,6 @@
     <w:p>
       <w:pPr>
         <w:ind w:firstLine="240"/>
-        <w:jc w:val="center"/>
       </w:pPr>
       <w:r>
         <w:rPr>
@@ -2408,7 +2406,6 @@
     <w:p/>
     <w:p>
       <w:pPr>
-        <w:jc w:val="center"/>
         <w:rPr>
           <w:b/>
           <w:bCs/>
@@ -2580,9 +2577,6 @@
     </w:p>
     <w:p/>
     <w:p>
-      <w:pPr>
-        <w:jc w:val="center"/>
-      </w:pPr>
       <w:r>
         <w:t xml:space="preserve">(2012: Obama) </w:t>
       </w:r>
@@ -3336,7 +3330,13 @@
         <w:t xml:space="preserve">6,029 </w:t>
       </w:r>
       <w:r>
-        <w:t>voters in 2020, 89 of them followed a voting pattern consistent with the change candidates identified in our CCI ranking.</w:t>
+        <w:t>voters, 89 of them followed a voting pattern consistent with the change candidates identified in our CCI ranking</w:t>
+      </w:r>
+      <w:r>
+        <w:t xml:space="preserve"> across three consecutive elections</w:t>
+      </w:r>
+      <w:r>
+        <w:t>.</w:t>
       </w:r>
       <w:r>
         <w:t xml:space="preserve"> While this subset initially seems worryingly small for deriving meaningful conclusions, the </w:t>
@@ -3459,7 +3459,6 @@
     <w:p>
       <w:pPr>
         <w:pStyle w:val="Caption"/>
-        <w:jc w:val="center"/>
         <w:rPr>
           <w:sz w:val="20"/>
           <w:szCs w:val="20"/>
@@ -3724,7 +3723,7 @@
         <w:rPr>
           <w:highlight w:val="magenta"/>
         </w:rPr>
-        <w:t xml:space="preserve"> column for indexing variables in the table like "Variables [1], [5], and [7]" </w:t>
+        <w:t xml:space="preserve"> column for indexing variables in the table like "Variables [1], [5], and [7]"</w:t>
       </w:r>
     </w:p>
     <w:p>
@@ -3821,7 +3820,7 @@
         <w:t>t</w:t>
       </w:r>
       <w:r>
-        <w:t xml:space="preserve">hey tend to have a more favourable view of Labour Unions, which is discussed in the following section. </w:t>
+        <w:t>hey tend to have a more favourable view of Labour Unions, which is discussed in the following section.</w:t>
       </w:r>
     </w:p>
     <w:p/>
@@ -4723,659 +4722,649 @@
     </w:p>
     <w:p>
       <w:r>
-        <w:t>In formulating a theory of change voters, we take the results of our quantitative studies (candidate change posturing and perception, vote-pattern filtering, and statistical independence testing) as a starting place, and refine these using qualitative assessment.</w:t>
-      </w:r>
-    </w:p>
-    <w:p/>
-    <w:p/>
+        <w:t>In formulating a theory of change voters, we take the results of our quantitative studies (candidate change posturing and perception</w:t>
+      </w:r>
+      <w:r>
+        <w:t xml:space="preserve"> -&gt; </w:t>
+      </w:r>
+      <w:r>
+        <w:t>vote-pattern filtering</w:t>
+      </w:r>
+      <w:r>
+        <w:t xml:space="preserve"> -&gt;</w:t>
+      </w:r>
+      <w:r>
+        <w:t xml:space="preserve"> statistical independence testing) as a starting place, and refine </w:t>
+      </w:r>
+      <w:r>
+        <w:t xml:space="preserve">the </w:t>
+      </w:r>
+      <w:r>
+        <w:t>insights</w:t>
+      </w:r>
+      <w:r>
+        <w:t xml:space="preserve"> using qualitative assessment.</w:t>
+      </w:r>
+      <w:r>
+        <w:t xml:space="preserve"> </w:t>
+      </w:r>
+    </w:p>
+    <w:p/>
+    <w:p>
+      <w:r>
+        <w:t xml:space="preserve">We begin with the theme of Economic Situation/ Perspective, and </w:t>
+      </w:r>
+      <w:r>
+        <w:t>highlight</w:t>
+      </w:r>
+      <w:r>
+        <w:t xml:space="preserve"> the fact that the results of our independence testing has very clearly validated a central aspect of our hypothesis: the inceptive assumption </w:t>
+      </w:r>
+      <w:r>
+        <w:t xml:space="preserve">of </w:t>
+      </w:r>
+      <w:r>
+        <w:t xml:space="preserve">a change voter's perceived/subconscious </w:t>
+      </w:r>
+      <w:r>
+        <w:t>Constant Financial Distress.</w:t>
+      </w:r>
+      <w:r>
+        <w:t xml:space="preserve"> This is substantiated by the fact that we saw not only </w:t>
+      </w:r>
+      <w:r>
+        <w:rPr>
+          <w:i/>
+          <w:iCs/>
+        </w:rPr>
+        <w:t>one</w:t>
+      </w:r>
+      <w:r>
+        <w:t xml:space="preserve"> measure of economic distress in the results, but a wide variety of indicators that together point to a more interesting definition of distress. We see that these voters had</w:t>
+      </w:r>
+      <w:r>
+        <w:t xml:space="preserve"> </w:t>
+      </w:r>
+      <w:r>
+        <w:rPr>
+          <w:i/>
+          <w:iCs/>
+        </w:rPr>
+        <w:t xml:space="preserve">not only </w:t>
+      </w:r>
+      <w:r>
+        <w:t>low</w:t>
+      </w:r>
+      <w:r>
+        <w:t xml:space="preserve">er </w:t>
+      </w:r>
+      <w:r>
+        <w:t>income</w:t>
+      </w:r>
+      <w:r>
+        <w:t>s on average</w:t>
+      </w:r>
+      <w:r>
+        <w:t xml:space="preserve">, but also </w:t>
+      </w:r>
+      <w:r>
+        <w:t>a perception of the economy as getting worse and an awareness of the income gap widening, which is a correlate of the stagnation of real wages</w:t>
+      </w:r>
+      <w:r>
+        <w:rPr>
+          <w:rStyle w:val="FootnoteReference"/>
+        </w:rPr>
+        <w:footnoteReference w:id="17"/>
+      </w:r>
+      <w:r>
+        <w:t>. Additionally, the timeline captured by the Income Gap variable (20 years) is further association with our own understanding of real wage stagnation since the early 2000s (citation).</w:t>
+      </w:r>
+      <w:r>
+        <w:t xml:space="preserve"> </w:t>
+      </w:r>
+      <w:r>
+        <w:t xml:space="preserve">Finally, we remember the high </w:t>
+      </w:r>
+      <w:r>
+        <w:t>favourability rating</w:t>
+      </w:r>
+      <w:r>
+        <w:t>s given to</w:t>
+      </w:r>
+      <w:r>
+        <w:t xml:space="preserve"> labour unions, </w:t>
+      </w:r>
+      <w:r>
+        <w:t>and take this (in conjunction with the observed lower average household income levels for CVoters) as</w:t>
+      </w:r>
+      <w:r>
+        <w:t xml:space="preserve"> signaling that CVoters </w:t>
+      </w:r>
+      <w:r>
+        <w:t>may be</w:t>
+      </w:r>
+      <w:r>
+        <w:t xml:space="preserve"> more likely to belong to blue collar</w:t>
+      </w:r>
+      <w:r>
+        <w:t xml:space="preserve"> industries,</w:t>
+      </w:r>
+      <w:r>
+        <w:t xml:space="preserve"> where labour unions are more commonplace</w:t>
+      </w:r>
+      <w:r>
+        <w:t xml:space="preserve"> (</w:t>
+      </w:r>
+      <w:r>
+        <w:rPr>
+          <w:highlight w:val="magenta"/>
+        </w:rPr>
+        <w:t>citation</w:t>
+      </w:r>
+      <w:r>
+        <w:t>)</w:t>
+      </w:r>
+      <w:r>
+        <w:t>, and where the evaporation of jobs and economic prosperity has been felt the most strongly in the American 21st century (</w:t>
+      </w:r>
+      <w:r>
+        <w:rPr>
+          <w:highlight w:val="magenta"/>
+        </w:rPr>
+        <w:t>citation</w:t>
+      </w:r>
+      <w:r>
+        <w:t>)</w:t>
+      </w:r>
+      <w:r>
+        <w:t>.</w:t>
+      </w:r>
+      <w:r>
+        <w:rPr>
+          <w:rStyle w:val="FootnoteReference"/>
+        </w:rPr>
+        <w:footnoteReference w:id="18"/>
+      </w:r>
+      <w:r>
+        <w:t xml:space="preserve"> </w:t>
+      </w:r>
+      <w:r>
+        <w:t xml:space="preserve"> </w:t>
+      </w:r>
+      <w:r>
+        <w:t xml:space="preserve">All of </w:t>
+      </w:r>
+      <w:r>
+        <w:t>these</w:t>
+      </w:r>
+      <w:r>
+        <w:t xml:space="preserve"> taken </w:t>
+      </w:r>
+      <w:r>
+        <w:t xml:space="preserve">together create solid </w:t>
+      </w:r>
+      <w:r>
+        <w:t xml:space="preserve">evidence for </w:t>
+      </w:r>
+      <w:r>
+        <w:t>including the P</w:t>
+      </w:r>
+      <w:r>
+        <w:t xml:space="preserve">erception of </w:t>
+      </w:r>
+      <w:r>
+        <w:t>Ec</w:t>
+      </w:r>
+      <w:r>
+        <w:t xml:space="preserve">onomic </w:t>
+      </w:r>
+      <w:r>
+        <w:t>D</w:t>
+      </w:r>
+      <w:r>
+        <w:t>istres</w:t>
+      </w:r>
+      <w:r>
+        <w:t>s</w:t>
+      </w:r>
+      <w:r>
+        <w:rPr>
+          <w:rStyle w:val="FootnoteReference"/>
+        </w:rPr>
+        <w:footnoteReference w:id="19"/>
+      </w:r>
+      <w:r>
+        <w:t xml:space="preserve"> as </w:t>
+      </w:r>
+      <w:r>
+        <w:t xml:space="preserve">a central part of our </w:t>
+      </w:r>
+      <w:r>
+        <w:t>T</w:t>
+      </w:r>
+      <w:r>
+        <w:t>heory</w:t>
+      </w:r>
+      <w:r>
+        <w:t xml:space="preserve"> of Change Voters</w:t>
+      </w:r>
+      <w:r>
+        <w:t xml:space="preserve"> going forward.</w:t>
+      </w:r>
+      <w:r>
+        <w:t xml:space="preserve"> </w:t>
+      </w:r>
+    </w:p>
+    <w:p>
+      <w:r>
+        <w:lastRenderedPageBreak/>
+        <w:t xml:space="preserve">We move to the second important aspect, which was an unspoken assumption of the paper (as it is an assumption in swing-voting more broadly), that of a roughly </w:t>
+      </w:r>
+      <w:r>
+        <w:t xml:space="preserve">'moderate' </w:t>
+      </w:r>
+      <w:r>
+        <w:t>political leaning of voters.</w:t>
+      </w:r>
+      <w:r>
+        <w:t xml:space="preserve"> Here, however, we find that our results are far more interesting than a simple 'centrist' explanation.</w:t>
+      </w:r>
+      <w:r>
+        <w:t xml:space="preserve"> Figure 5</w:t>
+      </w:r>
+      <w:r>
+        <w:t>, showing respondent scores for Left-Right Self-Placement, evidences this exactly.</w:t>
+      </w:r>
+    </w:p>
+    <w:p/>
+    <w:p>
+      <w:pPr>
+        <w:jc w:val="center"/>
+      </w:pPr>
+      <w:r>
+        <w:rPr>
+          <w:noProof/>
+        </w:rPr>
+        <w:drawing>
+          <wp:inline distT="0" distB="0" distL="0" distR="0" wp14:anchorId="596E661B" wp14:editId="7BD0BA86">
+            <wp:extent cx="3588499" cy="3873739"/>
+            <wp:effectExtent l="25400" t="25400" r="31115" b="25400"/>
+            <wp:docPr id="10" name="Picture 10"/>
+            <wp:cNvGraphicFramePr>
+              <a:graphicFrameLocks xmlns:a="http://schemas.openxmlformats.org/drawingml/2006/main" noChangeAspect="1"/>
+            </wp:cNvGraphicFramePr>
+            <a:graphic xmlns:a="http://schemas.openxmlformats.org/drawingml/2006/main">
+              <a:graphicData uri="http://schemas.openxmlformats.org/drawingml/2006/picture">
+                <pic:pic xmlns:pic="http://schemas.openxmlformats.org/drawingml/2006/picture">
+                  <pic:nvPicPr>
+                    <pic:cNvPr id="10" name="Picture 10"/>
+                    <pic:cNvPicPr/>
+                  </pic:nvPicPr>
+                  <pic:blipFill>
+                    <a:blip r:embed="rId11" cstate="print">
+                      <a:extLst>
+                        <a:ext uri="{28A0092B-C50C-407E-A947-70E740481C1C}">
+                          <a14:useLocalDpi xmlns:a14="http://schemas.microsoft.com/office/drawing/2010/main" val="0"/>
+                        </a:ext>
+                      </a:extLst>
+                    </a:blip>
+                    <a:stretch>
+                      <a:fillRect/>
+                    </a:stretch>
+                  </pic:blipFill>
+                  <pic:spPr>
+                    <a:xfrm>
+                      <a:off x="0" y="0"/>
+                      <a:ext cx="3590616" cy="3876024"/>
+                    </a:xfrm>
+                    <a:prstGeom prst="rect">
+                      <a:avLst/>
+                    </a:prstGeom>
+                    <a:ln w="15875">
+                      <a:solidFill>
+                        <a:srgbClr val="4472C4"/>
+                      </a:solidFill>
+                    </a:ln>
+                  </pic:spPr>
+                </pic:pic>
+              </a:graphicData>
+            </a:graphic>
+          </wp:inline>
+        </w:drawing>
+      </w:r>
+    </w:p>
+    <w:p/>
+    <w:p>
+      <w:r>
+        <w:t>We see that</w:t>
+      </w:r>
+      <w:r>
+        <w:t xml:space="preserve"> CVote</w:t>
+      </w:r>
+      <w:r>
+        <w:t>r</w:t>
+      </w:r>
+      <w:r>
+        <w:t>s are not only</w:t>
+      </w:r>
+      <w:r>
+        <w:t xml:space="preserve"> </w:t>
+      </w:r>
+      <w:r>
+        <w:t xml:space="preserve">grouped around the center of the scale (and thus interpretable through a 'centrist' explanation when analyzing only the mean score of 4.93, mentioned earlier), </w:t>
+      </w:r>
+      <w:r>
+        <w:t xml:space="preserve">but that they are in fact </w:t>
+      </w:r>
+      <w:r>
+        <w:rPr>
+          <w:i/>
+          <w:iCs/>
+        </w:rPr>
+        <w:t>strikingly unimodally</w:t>
+      </w:r>
+      <w:r>
+        <w:t xml:space="preserve"> </w:t>
+      </w:r>
+      <w:r>
+        <w:t>group</w:t>
+      </w:r>
+      <w:r>
+        <w:t xml:space="preserve"> around the specific response value of '5'. The sheer frequency of this value amongst CVoters, especially when compared to the less</w:t>
+      </w:r>
+      <w:r>
+        <w:t xml:space="preserve">-modal distribution for MVoters, makes us understand this behaviour as not a </w:t>
+      </w:r>
+      <w:r>
+        <w:rPr>
+          <w:i/>
+          <w:iCs/>
+        </w:rPr>
+        <w:t>centrist</w:t>
+      </w:r>
+      <w:r>
+        <w:t xml:space="preserve"> </w:t>
+      </w:r>
+      <w:r>
+        <w:rPr>
+          <w:i/>
+          <w:iCs/>
+        </w:rPr>
+        <w:t>leaning</w:t>
+      </w:r>
+      <w:r>
+        <w:t>, but instead as a</w:t>
+      </w:r>
+      <w:r>
+        <w:t xml:space="preserve"> </w:t>
+      </w:r>
+      <w:r>
+        <w:rPr>
+          <w:i/>
+          <w:iCs/>
+        </w:rPr>
+        <w:t>rejection</w:t>
+      </w:r>
+      <w:r>
+        <w:t xml:space="preserve"> of </w:t>
+      </w:r>
+      <w:r>
+        <w:t>the</w:t>
+      </w:r>
+      <w:r>
+        <w:t xml:space="preserve"> given</w:t>
+      </w:r>
+      <w:r>
+        <w:t xml:space="preserve"> </w:t>
+      </w:r>
+      <w:r>
+        <w:t>political spectrum and a conscious non-alignment with the ideological values available in America's de-facto (</w:t>
+      </w:r>
+      <w:r>
+        <w:rPr>
+          <w:highlight w:val="magenta"/>
+        </w:rPr>
+        <w:t>citation</w:t>
+      </w:r>
+      <w:r>
+        <w:t>) two-party system</w:t>
+      </w:r>
+      <w:r>
+        <w:t xml:space="preserve"> and </w:t>
+      </w:r>
+      <w:r>
+        <w:t>partisan politics</w:t>
+      </w:r>
+      <w:r>
+        <w:t>.</w:t>
+      </w:r>
+      <w:r>
+        <w:rPr>
+          <w:rStyle w:val="FootnoteReference"/>
+        </w:rPr>
+        <w:footnoteReference w:id="20"/>
+      </w:r>
+      <w:r>
+        <w:t xml:space="preserve"> This formulation of Change Voter political non-alignment is also supported by the </w:t>
+      </w:r>
+      <w:r>
+        <w:lastRenderedPageBreak/>
+        <w:t xml:space="preserve">observed attitudes of apathy towards the healthy functioning and safeguarding of Democracy in variables such as </w:t>
+      </w:r>
+      <w:r>
+        <w:t>passivity towards the balance of power between the branches of government</w:t>
+      </w:r>
+      <w:r>
+        <w:rPr>
+          <w:rStyle w:val="FootnoteReference"/>
+        </w:rPr>
+        <w:footnoteReference w:id="21"/>
+      </w:r>
+      <w:r>
+        <w:t>. The observed behaviours point us, then towards the second key pillar of our Theory of a Change Voter, which is the conscious non-alignment and rejection of the political environment</w:t>
+      </w:r>
+      <w:r>
+        <w:t>.</w:t>
+      </w:r>
+    </w:p>
+    <w:p/>
+    <w:p>
+      <w:r>
+        <w:t xml:space="preserve"> </w:t>
+      </w:r>
+    </w:p>
+    <w:p/>
+    <w:p/>
+    <w:p>
+      <w:r>
+        <w:t>Finally, we lean on science and low evidence for low info to reject a portion of our hypothesis.</w:t>
+      </w:r>
+    </w:p>
+    <w:p>
+      <w:r>
+        <w:t xml:space="preserve">However, we dont take science on its own going forward as its common measurement points (climate action) are heavily politicized and associated with democratic preference. </w:t>
+      </w:r>
+    </w:p>
     <w:p>
       <w:r>
         <w:rPr>
           <w:u w:val="single"/>
         </w:rPr>
-        <w:t>Econ</w:t>
-      </w:r>
-      <w:r>
-        <w:t>, validates us</w:t>
-      </w:r>
-    </w:p>
-    <w:p>
+        <w:t>Information</w:t>
+      </w:r>
       <w:r>
         <w:rPr>
           <w:u w:val="single"/>
         </w:rPr>
-        <w:t>Outlook</w:t>
-      </w:r>
-      <w:r>
-        <w:t>, further validates this constant stress/ clear desire for change,</w:t>
-      </w:r>
-    </w:p>
-    <w:p>
-      <w:r>
-        <w:t>but we dont use it because, in our theory, economic is actually confounder for outlook and wanting change.</w:t>
-      </w:r>
-      <w:r>
-        <w:t xml:space="preserve"> OR: simply say heavily correlated (</w:t>
+        <w:t>:</w:t>
+      </w:r>
+      <w:r>
+        <w:t xml:space="preserve"> </w:t>
+      </w:r>
+      <w:r>
+        <w:t xml:space="preserve">Lack of evidence </w:t>
+      </w:r>
+      <w:r>
+        <w:t>for low info</w:t>
+      </w:r>
+      <w:r>
+        <w:t xml:space="preserve"> </w:t>
+      </w:r>
+      <w:r>
+        <w:t>is a rejection of portion of our hypothesis, showing a change voter motivation to voter for change isn't necessarily composed of DISTRESS and EASILY MANIPULATABLE, but that these cvoters are actually politically informed but jaded.</w:t>
+      </w:r>
+    </w:p>
+    <w:p>
+      <w:r>
+        <w:t xml:space="preserve">Info: </w:t>
+      </w:r>
+    </w:p>
+    <w:p>
+      <w:r>
+        <w:t xml:space="preserve">Not necessarily low info: yes pence lower recall, but notably variables Pelosi, Merkel, SCOTUS were some of the least independent. </w:t>
+      </w:r>
+      <w:r>
+        <w:rPr>
+          <w:b/>
+          <w:bCs/>
+        </w:rPr>
+        <w:t>pull out those numbers</w:t>
+      </w:r>
+      <w:r>
+        <w:t xml:space="preserve">. </w:t>
+      </w:r>
+      <w:r>
+        <w:rPr>
+          <w:b/>
+          <w:bCs/>
+        </w:rPr>
+        <w:t>Also maybe in appendix have the table for all variables</w:t>
+      </w:r>
+      <w:r>
+        <w:t>.</w:t>
+      </w:r>
+    </w:p>
+    <w:p>
+      <w:r>
+        <w:t>Given that the hypothesis was that these would be low-info people, and that the results of this study REJECTED that hypothesis quite strongly, we take instead the opposite approach and theorize of them as high-information but jaded.</w:t>
+      </w:r>
+    </w:p>
+    <w:p/>
+    <w:p/>
+    <w:p>
+      <w:r>
+        <w:t xml:space="preserve">Finally </w:t>
+      </w:r>
+      <w:r>
+        <w:rPr>
+          <w:u w:val="single"/>
+        </w:rPr>
+        <w:t>Science and Climate</w:t>
+      </w:r>
+      <w:r>
+        <w:t xml:space="preserve"> we take as somewhat red herrings, since they are 1) so heavily politicized in 2020 due to covid 19 and 2) climate heavily associated with democratic voting</w:t>
+      </w:r>
+    </w:p>
+    <w:p/>
+    <w:p>
+      <w:r>
+        <w:t>Science</w:t>
+      </w:r>
+    </w:p>
+    <w:p>
+      <w:r>
+        <w:t>Fauci is not a great indicator of change voters because it was a very Red vs. Blue topic in 2020, given that Trump and his supporters disparaged Fauci and science in general (</w:t>
       </w:r>
       <w:r>
         <w:rPr>
           <w:highlight w:val="magenta"/>
         </w:rPr>
-        <w:t>would need citation?</w:t>
-      </w:r>
-      <w:r>
-        <w:t>)</w:t>
-      </w:r>
-      <w:r>
-        <w:t>.</w:t>
-      </w:r>
-    </w:p>
-    <w:p/>
-    <w:p>
-      <w:r>
-        <w:t xml:space="preserve">Then </w:t>
-      </w:r>
-      <w:r>
-        <w:rPr>
-          <w:u w:val="single"/>
-        </w:rPr>
-        <w:t>left-right non</w:t>
-      </w:r>
-      <w:r>
-        <w:rPr>
-          <w:u w:val="single"/>
-        </w:rPr>
-        <w:t>-</w:t>
-      </w:r>
-      <w:r>
-        <w:rPr>
-          <w:u w:val="single"/>
-        </w:rPr>
-        <w:t>alignment</w:t>
-      </w:r>
-      <w:r>
-        <w:t xml:space="preserve"> as REJECTION, not as CENTRISM. Look at uni-modal graph. Tells us that they are dissatisfied with current choices</w:t>
-      </w:r>
-      <w:r>
-        <w:t xml:space="preserve"> (?)</w:t>
-      </w:r>
-      <w:r>
-        <w:t>.</w:t>
-      </w:r>
-    </w:p>
-    <w:p/>
-    <w:p>
-      <w:r>
-        <w:rPr>
-          <w:u w:val="single"/>
-        </w:rPr>
-        <w:t>Democracy not important</w:t>
-      </w:r>
-      <w:r>
-        <w:t xml:space="preserve"> is also supported by the fact that econ is most pressing (so no time to care about democracy) and by non-alignment</w:t>
-      </w:r>
-      <w:r>
-        <w:t xml:space="preserve"> (because</w:t>
-      </w:r>
-      <w:r>
-        <w:t xml:space="preserve"> we don't care much about keeping a system alive that </w:t>
-      </w:r>
-      <w:r>
-        <w:t>isn</w:t>
-      </w:r>
-      <w:r>
-        <w:t>'</w:t>
-      </w:r>
-      <w:r>
-        <w:t>t helping us much</w:t>
-      </w:r>
-      <w:r>
-        <w:t>)</w:t>
-      </w:r>
-      <w:r>
-        <w:t>.</w:t>
-      </w:r>
-    </w:p>
-    <w:p/>
-    <w:p>
-      <w:r>
-        <w:rPr>
-          <w:u w:val="single"/>
-        </w:rPr>
-        <w:t>Information</w:t>
-      </w:r>
-      <w:r>
-        <w:rPr>
-          <w:u w:val="single"/>
-        </w:rPr>
-        <w:t>:</w:t>
-      </w:r>
-      <w:r>
-        <w:t xml:space="preserve"> </w:t>
-      </w:r>
-      <w:r>
-        <w:t xml:space="preserve">Lack of evidence </w:t>
-      </w:r>
-      <w:r>
-        <w:t>for low</w:t>
-      </w:r>
-      <w:r>
-        <w:t xml:space="preserve"> info</w:t>
-      </w:r>
-      <w:r>
-        <w:t xml:space="preserve"> </w:t>
-      </w:r>
-      <w:r>
-        <w:t>is a rejection of portion of our hypothesis</w:t>
-      </w:r>
-      <w:r>
-        <w:t xml:space="preserve">, </w:t>
-      </w:r>
-      <w:r>
-        <w:t xml:space="preserve">showing a change voter motivation to voter for change isn't necessarily composed of DISTRESS and EASILY MANIPULATABLE, but </w:t>
-      </w:r>
-      <w:r>
-        <w:t>that these cvoters are actually politically informed</w:t>
-      </w:r>
-      <w:r>
-        <w:t xml:space="preserve"> but jaded.</w:t>
-      </w:r>
-    </w:p>
-    <w:p/>
-    <w:p>
-      <w:r>
-        <w:t xml:space="preserve">Finally </w:t>
-      </w:r>
-      <w:r>
-        <w:rPr>
-          <w:u w:val="single"/>
-        </w:rPr>
-        <w:t>Science and Climate</w:t>
-      </w:r>
-      <w:r>
-        <w:t xml:space="preserve"> we</w:t>
-      </w:r>
-      <w:r>
-        <w:t xml:space="preserve"> take as somewhat red herrings, since they are 1) so heavily politicized in 2020 due to covid 19 and 2) climate heavily associated with democratic voting</w:t>
-      </w:r>
-    </w:p>
-    <w:p>
-      <w:r>
-        <w:t xml:space="preserve"> </w:t>
-      </w:r>
-    </w:p>
-    <w:p/>
-    <w:p/>
-    <w:p/>
-    <w:p/>
-    <w:p>
-      <w:r>
-        <w:rPr>
-          <w:b/>
-          <w:bCs/>
-          <w:u w:val="single"/>
-        </w:rPr>
-        <w:t>Econ</w:t>
-      </w:r>
-      <w:r>
-        <w:t>, validates</w:t>
-      </w:r>
-      <w:r>
-        <w:t xml:space="preserve"> </w:t>
-      </w:r>
-      <w:r>
-        <w:t>us</w:t>
-      </w:r>
-      <w:r>
-        <w:t xml:space="preserve">. </w:t>
-      </w:r>
-      <w:r>
-        <w:t>Income gap scale of 20 years in line with real wage stagnation assumption.</w:t>
-      </w:r>
-    </w:p>
-    <w:p>
-      <w:r>
-        <w:t>First,</w:t>
-      </w:r>
-      <w:r>
-        <w:t xml:space="preserve"> w</w:t>
-      </w:r>
-      <w:r>
-        <w:t>e take our motivating theory of Perceived Constant Financial Distress as being largely validated, and take it as a central part of our theory going forward. Several variables from our results highlight different aspects. Not ONLY low income, but also AWARENESS of income gap, etc, perception of ECON getting WORSE.</w:t>
-      </w:r>
-    </w:p>
-    <w:p>
-      <w:r>
-        <w:t>Coming back to their higher favourability rating of labour unions, we could interpret this as signaling that CVoters are more likely to belong to blue collar industries, where labour unions are more commonplace. This could also explain their choosing the 2020 change candidate, Joe Biden, as he was a famously pro-blue collar and labour union candidate (</w:t>
+        <w:t>citation</w:t>
+      </w:r>
+      <w:r>
+        <w:t>), making democrats in general much more kind to Fauci and Science.</w:t>
+      </w:r>
+    </w:p>
+    <w:p>
+      <w:r>
+        <w:t xml:space="preserve">We disregard science/ climate both because it is an issue that has exploded in popularity in the last 3 elections (and is thus a non-disambiguating indicator in earlier elections) and because it is largely taken to be a partisan (Democrat) issue </w:t>
       </w:r>
       <w:r>
         <w:rPr>
           <w:highlight w:val="magenta"/>
         </w:rPr>
-        <w:t>citation</w:t>
-      </w:r>
-      <w:r>
-        <w:t xml:space="preserve">). Similarly, this could explain Trump's win amongst these voters in 2016, as </w:t>
-      </w:r>
-      <w:r>
-        <w:rPr>
-          <w:i/>
-          <w:iCs/>
-        </w:rPr>
-        <w:t>he</w:t>
-      </w:r>
-      <w:r>
-        <w:t xml:space="preserve"> was the pro-working class candidate in the 2016 election (</w:t>
-      </w:r>
-      <w:r>
-        <w:rPr>
-          <w:highlight w:val="magenta"/>
-        </w:rPr>
-        <w:t>citation</w:t>
-      </w:r>
-      <w:r>
-        <w:t>).  and the 2024 pro-manufacturing candidate (</w:t>
-      </w:r>
-      <w:r>
-        <w:rPr>
-          <w:highlight w:val="magenta"/>
-        </w:rPr>
-        <w:t>citation</w:t>
-      </w:r>
-      <w:r>
-        <w:t>).</w:t>
-      </w:r>
-    </w:p>
-    <w:p>
-      <w:pPr>
-        <w:rPr>
-          <w:u w:val="single"/>
-        </w:rPr>
-      </w:pPr>
-    </w:p>
-    <w:p>
-      <w:r>
-        <w:rPr>
-          <w:b/>
-          <w:bCs/>
-          <w:u w:val="single"/>
-        </w:rPr>
-        <w:t>Outlook</w:t>
-      </w:r>
-      <w:r>
-        <w:t>, further validates this constant stress/ clear desire for change,</w:t>
-      </w:r>
-    </w:p>
-    <w:p>
-      <w:r>
-        <w:t>but we dont use it because, in our theory, economic is actually confounder for outlook and wanting change. OR: simply say heavily correlated (</w:t>
-      </w:r>
-      <w:r>
-        <w:rPr>
-          <w:highlight w:val="magenta"/>
-        </w:rPr>
-        <w:t>would need citation?</w:t>
-      </w:r>
-      <w:r>
-        <w:t>).</w:t>
-      </w:r>
-    </w:p>
-    <w:p>
-      <w:r>
-        <w:t>Outlook: Disregard because it is arguably just a re-formulation of economic worry AND it these questions are very new to the ANES, meaning we can't sort for them in previous years.</w:t>
-      </w:r>
-    </w:p>
-    <w:p>
-      <w:pPr>
-        <w:rPr>
-          <w:i/>
-          <w:iCs/>
-        </w:rPr>
-      </w:pPr>
-      <w:r>
-        <w:rPr>
-          <w:i/>
-          <w:iCs/>
-        </w:rPr>
-        <w:t xml:space="preserve">However, it does confirm a basic assumption of our hypothesis: </w:t>
-      </w:r>
-      <w:r>
-        <w:rPr>
-          <w:i/>
-          <w:iCs/>
-        </w:rPr>
-        <w:t>these people are in a constant state of stress/ crisis</w:t>
-      </w:r>
-      <w:r>
-        <w:rPr>
-          <w:i/>
-          <w:iCs/>
-        </w:rPr>
-        <w:t>.</w:t>
-      </w:r>
-      <w:r>
-        <w:rPr>
-          <w:i/>
-          <w:iCs/>
-        </w:rPr>
-        <w:t xml:space="preserve"> </w:t>
-      </w:r>
-      <w:r>
-        <w:rPr>
-          <w:i/>
-          <w:iCs/>
-        </w:rPr>
-        <w:t>C</w:t>
-      </w:r>
-      <w:r>
-        <w:rPr>
-          <w:i/>
-          <w:iCs/>
-        </w:rPr>
-        <w:t>aught in "past bad, future worse"</w:t>
-      </w:r>
-      <w:r>
-        <w:rPr>
-          <w:i/>
-          <w:iCs/>
-        </w:rPr>
-        <w:t>.</w:t>
-      </w:r>
-    </w:p>
-    <w:p/>
-    <w:p/>
-    <w:p>
-      <w:r>
-        <w:t xml:space="preserve">Then </w:t>
-      </w:r>
-      <w:r>
-        <w:rPr>
-          <w:b/>
-          <w:bCs/>
-          <w:u w:val="single"/>
-        </w:rPr>
-        <w:t>left-right non-alignment</w:t>
-      </w:r>
-      <w:r>
-        <w:t xml:space="preserve"> as REJECTION, not as CENTRISM. Look at uni-modal graph. Tells us that they are dissatisfied with current choices (?).</w:t>
-      </w:r>
-    </w:p>
-    <w:p>
-      <w:r>
-        <w:t>Left Right</w:t>
-      </w:r>
-    </w:p>
-    <w:p>
-      <w:r>
-        <w:t xml:space="preserve">Partisan Non-Alignment, which could be interpreted as a true political centrism, </w:t>
-      </w:r>
-      <w:r>
-        <w:rPr>
-          <w:highlight w:val="magenta"/>
-        </w:rPr>
-        <w:t>graph of extreme uni-modal leftright</w:t>
-      </w:r>
-      <w:r>
-        <w:t xml:space="preserve">, but is actually a conscious rejection of the status quo, partisan politics, and a lack of self-identification with parties. </w:t>
-      </w:r>
-      <w:r>
-        <w:rPr>
-          <w:highlight w:val="magenta"/>
-        </w:rPr>
-        <w:t>Need to talk about how these voters selected independents. Reference appendix or mention briefly</w:t>
-      </w:r>
-      <w:r>
-        <w:t>. Maybe also say how this is an important question, but not the focus of this paper, and also that even dissatisfied voters still vote for parties strategically (</w:t>
-      </w:r>
-      <w:r>
-        <w:rPr>
-          <w:highlight w:val="magenta"/>
-        </w:rPr>
-        <w:t>citation</w:t>
-      </w:r>
-      <w:r>
-        <w:t>).</w:t>
-      </w:r>
-    </w:p>
-    <w:p/>
-    <w:p/>
-    <w:p>
-      <w:r>
-        <w:rPr>
-          <w:u w:val="single"/>
-        </w:rPr>
-        <w:t>Democracy not important</w:t>
-      </w:r>
-      <w:r>
-        <w:t xml:space="preserve"> is also supported by the fact that econ is most pressing (so no time to care about democracy) and by non-alignment (because we don't care much about keeping a system alive that isn't helping us much).</w:t>
-      </w:r>
-    </w:p>
-    <w:p>
-      <w:r>
-        <w:t>More pressing problems than 'democracy': Yes free media important, but LESS important than... affordability for ex, Yes important branches of govt check each other, but LESS important [</w:t>
-      </w:r>
-      <w:r>
-        <w:rPr>
-          <w:i/>
-          <w:iCs/>
-        </w:rPr>
-        <w:t>checks out with Harris message falling flat</w:t>
-      </w:r>
-      <w:r>
-        <w:rPr>
-          <w:i/>
-          <w:iCs/>
-        </w:rPr>
-        <w:t xml:space="preserve"> </w:t>
-      </w:r>
-      <w:r>
-        <w:rPr>
-          <w:i/>
-          <w:iCs/>
-        </w:rPr>
-        <w:t>and why Trump24 was not perceived as threat</w:t>
-      </w:r>
-      <w:r>
-        <w:rPr>
-          <w:i/>
-          <w:iCs/>
-        </w:rPr>
-        <w:t xml:space="preserve">, </w:t>
-      </w:r>
-      <w:r>
-        <w:rPr>
-          <w:i/>
-          <w:iCs/>
-        </w:rPr>
-        <w:t>even though she should have been THE change candidate (late in race, minority, woman</w:t>
-      </w:r>
-      <w:r>
-        <w:rPr>
-          <w:i/>
-          <w:iCs/>
-        </w:rPr>
-        <w:t>)</w:t>
-      </w:r>
-      <w:r>
-        <w:t>]</w:t>
-      </w:r>
-    </w:p>
-    <w:p/>
-    <w:p/>
-    <w:p>
-      <w:r>
-        <w:rPr>
-          <w:u w:val="single"/>
-        </w:rPr>
-        <w:t>Information</w:t>
-      </w:r>
-      <w:r>
-        <w:rPr>
-          <w:u w:val="single"/>
-        </w:rPr>
-        <w:t>:</w:t>
-      </w:r>
-      <w:r>
-        <w:t xml:space="preserve"> </w:t>
-      </w:r>
-      <w:r>
-        <w:t xml:space="preserve">Lack of evidence </w:t>
-      </w:r>
-      <w:r>
-        <w:t>for low info</w:t>
-      </w:r>
-      <w:r>
-        <w:t xml:space="preserve"> </w:t>
-      </w:r>
-      <w:r>
-        <w:t>is a rejection of portion of our hypothesis, showing a change voter motivation to voter for change isn't necessarily composed of DISTRESS and EASILY MANIPULATABLE, but that these cvoters are actually politically informed but jaded.</w:t>
-      </w:r>
-    </w:p>
-    <w:p>
-      <w:r>
-        <w:t xml:space="preserve">Info: </w:t>
-      </w:r>
-    </w:p>
-    <w:p>
-      <w:r>
+        <w:t>(citation)</w:t>
+      </w:r>
+      <w:r>
+        <w:t xml:space="preserve">. Science is not helpful because it was very much a result-of-covid question, and as such is a 2020-specific indicator of change-voters, and thus not easily generalizable. </w:t>
+      </w:r>
+    </w:p>
+    <w:p>
+      <w:pPr>
+        <w:rPr>
+          <w:i/>
+          <w:iCs/>
+        </w:rPr>
+      </w:pPr>
+      <w:r>
+        <w:rPr>
+          <w:i/>
+          <w:iCs/>
+        </w:rPr>
+        <w:t xml:space="preserve">First, and perhaps most interestingly, are the two variables related to the feeling of the survey respondent towards Dr. Anthony Fauci (who held the position of Chief Medical Advisor to the President during the time at which this survey was conducted) and 'Scientists' as a general group. Respondents, asked to give a number between 0-100 representing how 'favourably' they felt towards Dr. Fauci and towards 'Scientists', were significantly more likely to give a positive score if they were CVoters. While the t-statistic (as noted earlier) does not paint the whole story, it tells us that, on average, CVoters see Dr. Fauci six points more favourably than MVoters, and </w:t>
+      </w:r>
+      <w:r>
+        <w:rPr>
+          <w:i/>
+          <w:iCs/>
+        </w:rPr>
         <w:lastRenderedPageBreak/>
-        <w:t xml:space="preserve">Not necessarily low info: yes pence lower recall, but notably variables Pelosi, Merkel, SCOTUS were some of the least independent. </w:t>
-      </w:r>
-      <w:r>
-        <w:rPr>
-          <w:b/>
-          <w:bCs/>
-        </w:rPr>
-        <w:t>pull out those numbers</w:t>
-      </w:r>
-      <w:r>
-        <w:t xml:space="preserve">. </w:t>
-      </w:r>
-      <w:r>
-        <w:rPr>
-          <w:b/>
-          <w:bCs/>
-        </w:rPr>
-        <w:t>Also maybe in appendix have the table for all variables</w:t>
-      </w:r>
-      <w:r>
-        <w:t>.</w:t>
-      </w:r>
-    </w:p>
-    <w:p>
-      <w:r>
-        <w:t>Given that the hypothesis was that these would be low-info people, and that the results of this study REJECTED that hypothesis quite strongly, we take instead the opposite approach and theorize of them as high-information but jaded.</w:t>
-      </w:r>
-    </w:p>
-    <w:p/>
-    <w:p/>
-    <w:p>
-      <w:r>
-        <w:t xml:space="preserve">Finally </w:t>
-      </w:r>
-      <w:r>
-        <w:rPr>
-          <w:u w:val="single"/>
-        </w:rPr>
-        <w:t>Science and Climate</w:t>
-      </w:r>
-      <w:r>
-        <w:t xml:space="preserve"> we take as somewhat red herrings, since they are 1) so heavily politicized in 2020 due to covid 19 and 2) climate heavily associated with democratic voting</w:t>
-      </w:r>
-    </w:p>
-    <w:p/>
-    <w:p>
-      <w:r>
-        <w:t>Science</w:t>
-      </w:r>
-    </w:p>
-    <w:p>
-      <w:r>
-        <w:t>Fauci is not a great indicator of change voters because it was a very Red vs. Blue topic in 2020, given that Trump and his supporters disparaged Fauci and science in general (</w:t>
-      </w:r>
-      <w:r>
-        <w:rPr>
-          <w:highlight w:val="magenta"/>
-        </w:rPr>
-        <w:t>citation</w:t>
-      </w:r>
-      <w:r>
-        <w:t>), making democrats in general much more kind to Fauci and Science.</w:t>
-      </w:r>
-    </w:p>
-    <w:p>
-      <w:r>
-        <w:t xml:space="preserve">We disregard science/ climate both because it is an issue that has exploded in popularity in the last 3 elections (and is thus a non-disambiguating indicator in earlier elections) and because it is largely taken to be a partisan (Democrat) issue </w:t>
-      </w:r>
-      <w:r>
-        <w:rPr>
-          <w:highlight w:val="magenta"/>
-        </w:rPr>
-        <w:t>(citation)</w:t>
-      </w:r>
-      <w:r>
-        <w:t xml:space="preserve">. Science is not helpful because it was very much a result-of-covid question, and as such is a 2020-specific indicator of change-voters, and thus not easily generalizable. </w:t>
-      </w:r>
-    </w:p>
-    <w:p>
-      <w:pPr>
-        <w:rPr>
-          <w:i/>
-          <w:iCs/>
-        </w:rPr>
-      </w:pPr>
-      <w:r>
-        <w:rPr>
-          <w:i/>
-          <w:iCs/>
-        </w:rPr>
-        <w:t xml:space="preserve">First, and perhaps most interestingly, are the two variables related to the feeling of the survey respondent towards Dr. Anthony Fauci (who held the position of Chief Medical Advisor to the President during the time at which this survey was conducted) and 'Scientists' as a general group. Respondents, asked to give a number between 0-100 representing how 'favourably' they felt towards Dr. Fauci and towards 'Scientists', were significantly more likely to give a positive score if they were CVoters. While the t-statistic (as noted earlier) does not paint the whole story, it tells us that, on average, CVoters see Dr. Fauci six points more favourably than MVoters, and Scientists five points more favourably, adjusted for variance. Figure 2 below expands on this to show just how severe the difference in distributions really is. For Dr. Fauci, we see the great majority of respondents score him at seventy-five or above, while Scientists receive a similar (though less extremely distinct) scoring trend. </w:t>
-      </w:r>
-    </w:p>
-    <w:p>
-      <w:pPr>
-        <w:rPr>
-          <w:i/>
-          <w:iCs/>
-        </w:rPr>
-      </w:pPr>
-    </w:p>
-    <w:p>
-      <w:pPr>
-        <w:rPr>
-          <w:i/>
-          <w:iCs/>
-        </w:rPr>
-      </w:pPr>
-    </w:p>
-    <w:p/>
-    <w:p/>
-    <w:p/>
-    <w:p/>
-    <w:p/>
-    <w:p/>
-    <w:p/>
-    <w:p/>
-    <w:p/>
-    <w:p/>
-    <w:p/>
-    <w:p/>
-    <w:p/>
-    <w:p/>
-    <w:p/>
-    <w:p/>
-    <w:p/>
-    <w:p/>
-    <w:p/>
-    <w:p/>
-    <w:p/>
-    <w:p/>
-    <w:p/>
-    <w:p/>
-    <w:p/>
-    <w:p>
-      <w:pPr>
-        <w:jc w:val="center"/>
+        <w:t xml:space="preserve">Scientists five points more favourably, adjusted for variance. Figure 2 below expands on this to show just how severe the difference in distributions really is. For Dr. Fauci, we see the great majority of respondents score him at seventy-five or above, while Scientists receive a similar (though less extremely distinct) scoring trend. </w:t>
+      </w:r>
+    </w:p>
+    <w:p>
+      <w:pPr>
+        <w:rPr>
+          <w:i/>
+          <w:iCs/>
+        </w:rPr>
+      </w:pPr>
+    </w:p>
+    <w:p>
+      <w:pPr>
+        <w:rPr>
+          <w:i/>
+          <w:iCs/>
+        </w:rPr>
+      </w:pPr>
+    </w:p>
+    <w:p/>
+    <w:p/>
+    <w:p/>
+    <w:p/>
+    <w:p/>
+    <w:p/>
+    <w:p/>
+    <w:p/>
+    <w:p/>
+    <w:p/>
+    <w:p/>
+    <w:p/>
+    <w:p/>
+    <w:p/>
+    <w:p/>
+    <w:p/>
+    <w:p/>
+    <w:p/>
+    <w:p/>
+    <w:p/>
+    <w:p/>
+    <w:p/>
+    <w:p/>
+    <w:p/>
+    <w:p/>
+    <w:p>
+      <w:pPr>
         <w:rPr>
           <w:b/>
           <w:bCs/>
@@ -5520,6 +5509,7 @@
     </w:p>
     <w:p>
       <w:r>
+        <w:lastRenderedPageBreak/>
         <w:t xml:space="preserve">S3.1 </w:t>
       </w:r>
       <w:r>
@@ -5838,6 +5828,7 @@
         <w:rPr>
           <w:u w:val="single"/>
         </w:rPr>
+        <w:lastRenderedPageBreak/>
         <w:t>Information Level</w:t>
       </w:r>
       <w:r>
@@ -6130,6 +6121,8 @@
         <w:t xml:space="preserve"> The validity of this propensity is examined in the results section.</w:t>
       </w:r>
     </w:p>
+    <w:p/>
+    <w:p/>
     <w:p/>
     <w:p/>
     <w:p/>
@@ -6193,6 +6186,7 @@
         <w:rPr>
           <w:noProof/>
         </w:rPr>
+        <w:lastRenderedPageBreak/>
         <w:drawing>
           <wp:inline distT="0" distB="0" distL="0" distR="0" wp14:anchorId="2EE96DAA" wp14:editId="598475A4">
             <wp:extent cx="5943600" cy="5094605"/>
@@ -6209,7 +6203,7 @@
                     <pic:cNvPicPr/>
                   </pic:nvPicPr>
                   <pic:blipFill>
-                    <a:blip r:embed="rId11" cstate="print">
+                    <a:blip r:embed="rId12" cstate="print">
                       <a:extLst>
                         <a:ext uri="{28A0092B-C50C-407E-A947-70E740481C1C}">
                           <a14:useLocalDpi xmlns:a14="http://schemas.microsoft.com/office/drawing/2010/main" val="0"/>
@@ -6343,703 +6337,672 @@
         <w:t>, and the light purple 'X' denotes which of the two Mean Scores was greater</w:t>
       </w:r>
       <w:r>
-        <w:t xml:space="preserve">. In other words, the 'X' tells us which candidate's voters were more 'Change'-minded. Whose voters had, </w:t>
-      </w:r>
-      <w:r>
+        <w:t>. In other words, the 'X' tells us which candidate's voters were more 'Change'-minded. Whose voters had, on average, higher Voter Change Scores.</w:t>
+      </w:r>
+      <w:r>
+        <w:t xml:space="preserve"> Example, </w:t>
+      </w:r>
+      <w:r>
+        <w:t>Bush 2000: very vertical, which speaks to the fact that the election was so close between Gore and Bush.</w:t>
+      </w:r>
+    </w:p>
+    <w:p/>
+    <w:p/>
+    <w:p>
+      <w:r>
+        <w:t xml:space="preserve">Basic Trends: For all except 2016, the change candidate's voters </w:t>
+      </w:r>
+      <w:r>
+        <w:t xml:space="preserve">had a greater propensity for </w:t>
+      </w:r>
+      <w:r>
+        <w:t>change</w:t>
+      </w:r>
+      <w:r>
+        <w:t>, illustrated by the fact that the average of Voter Change Scores is greater for the candidate</w:t>
+      </w:r>
+      <w:r>
+        <w:t xml:space="preserve"> in each election</w:t>
+      </w:r>
+      <w:r>
+        <w:t xml:space="preserve"> with</w:t>
+      </w:r>
+      <w:r>
+        <w:t xml:space="preserve"> a</w:t>
+      </w:r>
+      <w:r>
+        <w:t xml:space="preserve"> higher CCI score.</w:t>
+      </w:r>
+    </w:p>
+    <w:p/>
+    <w:p>
+      <w:r>
+        <w:t>Shape of L</w:t>
+      </w:r>
+      <w:r>
+        <w:t>OESS</w:t>
+      </w:r>
+      <w:r>
+        <w:t xml:space="preserve"> lines-- </w:t>
+      </w:r>
+    </w:p>
+    <w:p>
+      <w:r>
+        <w:t>Bush 2000: very parabolic, meaning he capture</w:t>
+      </w:r>
+      <w:r>
+        <w:t>d</w:t>
+      </w:r>
+      <w:r>
+        <w:t xml:space="preserve"> the </w:t>
+      </w:r>
+      <w:r>
+        <w:t xml:space="preserve">voters with </w:t>
+      </w:r>
+      <w:r>
+        <w:t>lowest change and highest change</w:t>
+      </w:r>
+      <w:r>
+        <w:t xml:space="preserve"> propensities</w:t>
+      </w:r>
+      <w:r>
+        <w:t xml:space="preserve"> (makes sense, since he played 'compassionate conservatism', so conservatives still went for him</w:t>
+      </w:r>
+      <w:r>
+        <w:t xml:space="preserve">, and he was </w:t>
+      </w:r>
+      <w:r>
+        <w:t xml:space="preserve">country club republican, so rich people [less likely to score high on economic worries] </w:t>
+      </w:r>
+      <w:r>
+        <w:t>voted for him</w:t>
+      </w:r>
+      <w:r>
+        <w:t>)</w:t>
+      </w:r>
+    </w:p>
+    <w:p>
+      <w:r>
+        <w:t>In 2004, we see an 'S' (almost logistic) shape meaning that, as voters became more change-minded, they became more likely to vote for Kerry.</w:t>
+      </w:r>
+    </w:p>
+    <w:p>
+      <w:r>
+        <w:t>Obama has a very interesting pattern here, in that his LOESS curves for 2008 and 2012 are exceedingly similar in shape, and differ effectively only in 'intercept'. Their shape tells us that</w:t>
+      </w:r>
+      <w:r>
+        <w:t xml:space="preserve"> the </w:t>
+      </w:r>
+      <w:r>
+        <w:rPr>
+          <w:i/>
+          <w:iCs/>
+        </w:rPr>
+        <w:t xml:space="preserve">make-up </w:t>
+      </w:r>
+      <w:r>
+        <w:t xml:space="preserve">of </w:t>
+      </w:r>
+      <w:r>
+        <w:t xml:space="preserve">his base was </w:t>
+      </w:r>
+      <w:r>
+        <w:t>similar in both elections (</w:t>
+      </w:r>
+      <w:r>
+        <w:t>captur</w:t>
+      </w:r>
+      <w:r>
+        <w:t>ing</w:t>
+      </w:r>
+      <w:r>
+        <w:t xml:space="preserve"> both low-change and high-change voters, but los</w:t>
+      </w:r>
+      <w:r>
+        <w:t>ing</w:t>
+      </w:r>
+      <w:r>
+        <w:t xml:space="preserve"> out on medium-low-change voters</w:t>
+      </w:r>
+      <w:r>
+        <w:t>)</w:t>
+      </w:r>
+      <w:r>
+        <w:t xml:space="preserve">, </w:t>
+      </w:r>
+      <w:r>
+        <w:t xml:space="preserve">while the lowered intercept in 2012 illustrates the fact that </w:t>
+      </w:r>
+      <w:r>
+        <w:t xml:space="preserve">win-margin went from </w:t>
+      </w:r>
+      <w:r>
+        <w:t xml:space="preserve">7% </w:t>
+      </w:r>
+      <w:r>
+        <w:t xml:space="preserve">in 2008 against McCain </w:t>
+      </w:r>
+      <w:r>
+        <w:t>to 4%</w:t>
+      </w:r>
+      <w:r>
+        <w:t xml:space="preserve"> in 2012 against Romney.</w:t>
+      </w:r>
+    </w:p>
+    <w:p>
+      <w:r>
+        <w:t>In 2016 we see the only result inconsistent with the expected voting pattern, showing that voters with higher propensity for change actually had a greater probability of voting for Clinton</w:t>
+      </w:r>
+      <w:r>
+        <w:t xml:space="preserve">, who was decisively </w:t>
+      </w:r>
+      <w:r>
+        <w:rPr>
+          <w:i/>
+          <w:iCs/>
+        </w:rPr>
+        <w:t xml:space="preserve">not </w:t>
+      </w:r>
+      <w:r>
+        <w:t>the change candidate in 2016</w:t>
+      </w:r>
+      <w:r>
+        <w:t xml:space="preserve">. </w:t>
+      </w:r>
+      <w:r>
+        <w:t>T</w:t>
+      </w:r>
+      <w:r>
+        <w:t>wo</w:t>
+      </w:r>
+      <w:r>
+        <w:t xml:space="preserve"> explanations for this </w:t>
+      </w:r>
+      <w:r>
+        <w:t xml:space="preserve">may </w:t>
+      </w:r>
+      <w:r>
+        <w:t xml:space="preserve">exist. </w:t>
+      </w:r>
+      <w:r>
+        <w:t>First</w:t>
+      </w:r>
+      <w:r>
+        <w:t xml:space="preserve">, </w:t>
+      </w:r>
+      <w:r>
+        <w:rPr>
+          <w:highlight w:val="magenta"/>
+        </w:rPr>
+        <w:t>that polls and surveys for the 2016 election famously under-surveyed the demographics that ended up voting for Trump</w:t>
+      </w:r>
+      <w:r>
+        <w:t xml:space="preserve">, largely because Trump </w:t>
+      </w:r>
+      <w:r>
+        <w:t>succeeded in forming a new coalition of voters, many of which had not been voting in previous elections.</w:t>
+      </w:r>
+      <w:r>
+        <w:t xml:space="preserve"> Logically, this could mean that an important portion of the people that voted for Trump in 2016 are simply not represented in the ANES survey of that year, which is further evidence by a mismatch in the real-world popular vote margin and the one found in the ANES 2016 dataset</w:t>
+      </w:r>
+      <w:r>
+        <w:rPr>
+          <w:rStyle w:val="FootnoteReference"/>
+        </w:rPr>
+        <w:footnoteReference w:id="22"/>
+      </w:r>
+      <w:r>
+        <w:t xml:space="preserve">. Second, </w:t>
+      </w:r>
+      <w:r>
+        <w:t xml:space="preserve">that our </w:t>
+      </w:r>
+      <w:r>
+        <w:t xml:space="preserve">CCI measure is </w:t>
+      </w:r>
+      <w:r>
+        <w:t xml:space="preserve">imperfect (which it certainly is), and is severely </w:t>
+      </w:r>
+      <w:r>
+        <w:t xml:space="preserve">underrepresenting the </w:t>
+      </w:r>
+      <w:r>
+        <w:t>appeal</w:t>
+      </w:r>
+      <w:r>
+        <w:t xml:space="preserve"> that Clinton being th</w:t>
+      </w:r>
+      <w:r>
+        <w:t>e first</w:t>
+      </w:r>
+      <w:r>
+        <w:t>-</w:t>
+      </w:r>
+      <w:r>
+        <w:t>ev</w:t>
+      </w:r>
+      <w:r>
+        <w:t>er</w:t>
+      </w:r>
+      <w:r>
+        <w:t xml:space="preserve"> woman to reach the presidential stage </w:t>
+      </w:r>
+      <w:r>
+        <w:rPr>
+          <w:i/>
+          <w:iCs/>
+        </w:rPr>
+        <w:t>had</w:t>
+      </w:r>
+      <w:r>
+        <w:t xml:space="preserve"> for Change-Propense Voters.</w:t>
+      </w:r>
+      <w:r>
+        <w:t xml:space="preserve"> </w:t>
+      </w:r>
+      <w:r>
+        <w:t xml:space="preserve">For some voters looking for </w:t>
+      </w:r>
+      <w:r>
+        <w:t>change in 201</w:t>
+      </w:r>
+      <w:r>
+        <w:t>6,</w:t>
+      </w:r>
+      <w:r>
+        <w:t xml:space="preserve"> Clinton's gender </w:t>
+      </w:r>
+      <w:r>
+        <w:t xml:space="preserve">may have been </w:t>
+      </w:r>
+      <w:r>
+        <w:rPr>
+          <w:i/>
+          <w:iCs/>
+        </w:rPr>
+        <w:t xml:space="preserve">the </w:t>
+      </w:r>
+      <w:r>
+        <w:t xml:space="preserve">quintessential </w:t>
+      </w:r>
+      <w:r>
+        <w:t>indicator of 'change'</w:t>
+      </w:r>
+      <w:r>
+        <w:t>.</w:t>
+      </w:r>
+    </w:p>
+    <w:p>
+      <w:r>
+        <w:t>Finally, in 2020 we see the most stark behaviour in the LOESS curve between Biden and Trump.</w:t>
+      </w:r>
+      <w:r>
+        <w:t xml:space="preserve"> Here we see Trump, a particularly divisive incumbent who was dealing with the onset and aftermath of the first wave of the Covid-19 Pandemic in 2020, perform terribly among voters with higher change scores</w:t>
+      </w:r>
+      <w:r>
+        <w:t xml:space="preserve"> (</w:t>
+      </w:r>
+      <w:r>
+        <w:rPr>
+          <w:highlight w:val="magenta"/>
+        </w:rPr>
+        <w:t>VCS</w:t>
+      </w:r>
+      <w:r>
+        <w:t>?)</w:t>
+      </w:r>
+      <w:r>
+        <w:t>, with Biden taking these voters</w:t>
+      </w:r>
+      <w:r>
+        <w:t xml:space="preserve"> comfortably.</w:t>
+      </w:r>
+    </w:p>
+    <w:p/>
+    <w:p/>
+    <w:p/>
+    <w:p/>
+    <w:p/>
+    <w:p/>
+    <w:p/>
+    <w:p>
+      <w:r>
+        <w:rPr>
+          <w:b/>
+          <w:bCs/>
+        </w:rPr>
         <w:lastRenderedPageBreak/>
-        <w:t>on average, higher Voter Change Scores.</w:t>
-      </w:r>
-      <w:r>
-        <w:t xml:space="preserve"> Example, </w:t>
-      </w:r>
-      <w:r>
-        <w:t>Bush 2000: very vertical, which speaks to the fact that the election was so close between Gore and Bush.</w:t>
-      </w:r>
-    </w:p>
-    <w:p/>
-    <w:p/>
-    <w:p>
-      <w:r>
-        <w:t xml:space="preserve">Basic Trends: For all except 2016, the change candidate's voters </w:t>
-      </w:r>
-      <w:r>
-        <w:t xml:space="preserve">had a greater propensity for </w:t>
-      </w:r>
-      <w:r>
-        <w:t>change</w:t>
-      </w:r>
-      <w:r>
-        <w:t>, illustrated by the fact that the average of Voter Change Scores is greater for the candidate</w:t>
-      </w:r>
-      <w:r>
-        <w:t xml:space="preserve"> in each election</w:t>
-      </w:r>
-      <w:r>
-        <w:t xml:space="preserve"> with</w:t>
-      </w:r>
-      <w:r>
-        <w:t xml:space="preserve"> a</w:t>
-      </w:r>
-      <w:r>
-        <w:t xml:space="preserve"> higher CCI score.</w:t>
-      </w:r>
-    </w:p>
-    <w:p/>
-    <w:p>
-      <w:r>
-        <w:t>Shape of L</w:t>
-      </w:r>
-      <w:r>
-        <w:t>OESS</w:t>
-      </w:r>
-      <w:r>
-        <w:t xml:space="preserve"> lines-- </w:t>
-      </w:r>
-    </w:p>
-    <w:p>
-      <w:r>
-        <w:t>Bush 2000: very parabolic, meaning he capture</w:t>
-      </w:r>
-      <w:r>
-        <w:t>d</w:t>
-      </w:r>
-      <w:r>
-        <w:t xml:space="preserve"> the </w:t>
-      </w:r>
-      <w:r>
-        <w:t xml:space="preserve">voters with </w:t>
-      </w:r>
-      <w:r>
-        <w:t>lowest change and highest change</w:t>
-      </w:r>
-      <w:r>
-        <w:t xml:space="preserve"> propensities</w:t>
-      </w:r>
-      <w:r>
-        <w:t xml:space="preserve"> (makes sense, since he played 'compassionate conservatism', so conservatives still went for him</w:t>
-      </w:r>
-      <w:r>
-        <w:t xml:space="preserve">, and he was </w:t>
-      </w:r>
-      <w:r>
-        <w:t xml:space="preserve">country club republican, so rich people [less likely to score high on economic worries] </w:t>
-      </w:r>
-      <w:r>
-        <w:t>voted for him</w:t>
-      </w:r>
-      <w:r>
-        <w:t>)</w:t>
-      </w:r>
-    </w:p>
-    <w:p>
-      <w:r>
-        <w:t>In 2004, we see an 'S' (almost logistic) shape meaning that, as voters became more change-minded, they became more likely to vote for Kerry.</w:t>
-      </w:r>
-    </w:p>
-    <w:p>
-      <w:r>
-        <w:t>Obama has a very interesting pattern here, in that his LOESS curves for 2008 and 2012 are exceedingly similar in shape, and differ effectively only in 'intercept'. Their shape tells us that</w:t>
-      </w:r>
-      <w:r>
-        <w:t xml:space="preserve"> the </w:t>
-      </w:r>
-      <w:r>
-        <w:rPr>
-          <w:i/>
-          <w:iCs/>
-        </w:rPr>
-        <w:t xml:space="preserve">make-up </w:t>
-      </w:r>
-      <w:r>
-        <w:t xml:space="preserve">of </w:t>
-      </w:r>
-      <w:r>
-        <w:t xml:space="preserve">his base was </w:t>
-      </w:r>
-      <w:r>
-        <w:t>similar in both elections (</w:t>
-      </w:r>
-      <w:r>
-        <w:t>captur</w:t>
-      </w:r>
-      <w:r>
-        <w:t>ing</w:t>
-      </w:r>
-      <w:r>
-        <w:t xml:space="preserve"> both low-change and high-change voters, but los</w:t>
-      </w:r>
-      <w:r>
-        <w:t>ing</w:t>
-      </w:r>
-      <w:r>
-        <w:t xml:space="preserve"> out on medium-low-change voters</w:t>
-      </w:r>
-      <w:r>
-        <w:t>)</w:t>
-      </w:r>
-      <w:r>
-        <w:t xml:space="preserve">, </w:t>
-      </w:r>
-      <w:r>
-        <w:t xml:space="preserve">while the lowered intercept in 2012 illustrates the fact that </w:t>
-      </w:r>
-      <w:r>
-        <w:t xml:space="preserve">win-margin went from </w:t>
-      </w:r>
-      <w:r>
-        <w:t xml:space="preserve">7% </w:t>
-      </w:r>
-      <w:r>
-        <w:t xml:space="preserve">in 2008 against McCain </w:t>
-      </w:r>
-      <w:r>
-        <w:t>to 4%</w:t>
-      </w:r>
-      <w:r>
-        <w:t xml:space="preserve"> in 2012 against Romney.</w:t>
-      </w:r>
-    </w:p>
-    <w:p>
-      <w:r>
-        <w:t>In 2016 we see the only result inconsistent with the expected voting pattern, showing that voters with higher propensity for change actually had a greater probability of voting for Clinton</w:t>
-      </w:r>
-      <w:r>
-        <w:t xml:space="preserve">, who was decisively </w:t>
-      </w:r>
-      <w:r>
-        <w:rPr>
-          <w:i/>
-          <w:iCs/>
-        </w:rPr>
-        <w:t xml:space="preserve">not </w:t>
-      </w:r>
-      <w:r>
-        <w:t>the change candidate in 2016</w:t>
-      </w:r>
-      <w:r>
-        <w:t xml:space="preserve">. </w:t>
-      </w:r>
-      <w:r>
-        <w:t>T</w:t>
-      </w:r>
-      <w:r>
-        <w:t>wo</w:t>
-      </w:r>
-      <w:r>
-        <w:t xml:space="preserve"> explanations for this </w:t>
-      </w:r>
-      <w:r>
-        <w:t xml:space="preserve">may </w:t>
-      </w:r>
-      <w:r>
-        <w:t xml:space="preserve">exist. </w:t>
-      </w:r>
-      <w:r>
-        <w:t>First</w:t>
-      </w:r>
-      <w:r>
-        <w:t xml:space="preserve">, </w:t>
+        <w:t xml:space="preserve">OVERALL </w:t>
+      </w:r>
+      <w:r>
+        <w:rPr>
+          <w:b/>
+          <w:bCs/>
+        </w:rPr>
+        <w:t>Discussion</w:t>
+      </w:r>
+      <w:r>
+        <w:rPr>
+          <w:b/>
+          <w:bCs/>
+        </w:rPr>
+        <w:t xml:space="preserve"> </w:t>
+      </w:r>
+      <w:r>
+        <w:rPr>
+          <w:b/>
+          <w:bCs/>
+        </w:rPr>
+        <w:t>(of all studies together)</w:t>
+      </w:r>
+      <w:r>
+        <w:rPr>
+          <w:b/>
+          <w:bCs/>
+        </w:rPr>
+        <w:t xml:space="preserve"> and</w:t>
+      </w:r>
+      <w:r>
+        <w:rPr>
+          <w:b/>
+          <w:bCs/>
+        </w:rPr>
+        <w:t xml:space="preserve"> Implications</w:t>
+      </w:r>
+    </w:p>
+    <w:p/>
+    <w:p>
+      <w:r>
+        <w:t xml:space="preserve">Tough to say whether our hypothesis is true. The reality of real wage stagnation is having massive effects on electorate make-up, no doubt. </w:t>
+      </w:r>
+    </w:p>
+    <w:p>
+      <w:r>
+        <w:t>Our approach is good, but flawed.</w:t>
+      </w:r>
+    </w:p>
+    <w:p/>
+    <w:p>
+      <w:r>
+        <w:t>Parties need to see that yes it's 'the economy' but it's also a more significant understanding of the economy and of the functioning of society in an advanced, globalized democracy. Winners and losers. We see in nafta rhetoric. Some left behind while other rising exponentially. Coast vs heartland. Left behind by political establishment. It's not just because people didn't understand the threat that trump posed to democracy, it's that they didnt care. They believed he would bring change more credibly than Harris, and so he won.</w:t>
+      </w:r>
+    </w:p>
+    <w:p/>
+    <w:p/>
+    <w:p/>
+    <w:p>
+      <w:pPr>
+        <w:rPr>
+          <w:b/>
+          <w:bCs/>
+        </w:rPr>
+      </w:pPr>
+    </w:p>
+    <w:p>
+      <w:pPr>
+        <w:rPr>
+          <w:b/>
+          <w:bCs/>
+        </w:rPr>
+      </w:pPr>
+    </w:p>
+    <w:p>
+      <w:pPr>
+        <w:rPr>
+          <w:b/>
+          <w:bCs/>
+        </w:rPr>
+      </w:pPr>
+    </w:p>
+    <w:p>
+      <w:pPr>
+        <w:rPr>
+          <w:b/>
+          <w:bCs/>
+        </w:rPr>
+      </w:pPr>
+    </w:p>
+    <w:p>
+      <w:pPr>
+        <w:rPr>
+          <w:b/>
+          <w:bCs/>
+        </w:rPr>
+      </w:pPr>
+    </w:p>
+    <w:p>
+      <w:r>
+        <w:rPr>
+          <w:b/>
+          <w:bCs/>
+        </w:rPr>
+        <w:t>LIMITATIONS</w:t>
+      </w:r>
+      <w:r>
+        <w:rPr>
+          <w:b/>
+          <w:bCs/>
+        </w:rPr>
+        <w:t xml:space="preserve"> and FUTURE WORK</w:t>
+      </w:r>
+    </w:p>
+    <w:p>
+      <w:r>
+        <w:rPr>
+          <w:b/>
+          <w:bCs/>
+        </w:rPr>
+        <w:t>Limitations</w:t>
+      </w:r>
+    </w:p>
+    <w:p>
+      <w:r>
+        <w:t xml:space="preserve">Change is not defined the same for everyone. Many people may consider themselves 'change' voters, and be voting for different </w:t>
+      </w:r>
+      <w:r>
+        <w:rPr>
+          <w:i/>
+          <w:iCs/>
+        </w:rPr>
+        <w:t>types</w:t>
+      </w:r>
+      <w:r>
+        <w:t xml:space="preserve"> of 'change'. An example could be our </w:t>
+      </w:r>
+      <w:r>
+        <w:t>failure to correctly assess Clinton's appeal in 2016</w:t>
+      </w:r>
+      <w:r>
+        <w:t xml:space="preserve"> and the fact that, </w:t>
+      </w:r>
+      <w:r>
+        <w:t>for some people</w:t>
+      </w:r>
+      <w:r>
+        <w:t>,</w:t>
+      </w:r>
+      <w:r>
+        <w:t xml:space="preserve"> the mere fact that she was a woman</w:t>
+      </w:r>
+      <w:r>
+        <w:rPr>
+          <w:rStyle w:val="FootnoteReference"/>
+        </w:rPr>
+        <w:footnoteReference w:id="23"/>
+      </w:r>
+      <w:r>
+        <w:t xml:space="preserve"> </w:t>
+      </w:r>
+      <w:r>
+        <w:t>was more than enough to see her as the candidate of 'Change'</w:t>
+      </w:r>
+      <w:r>
+        <w:rPr>
+          <w:rStyle w:val="FootnoteReference"/>
+        </w:rPr>
+        <w:footnoteReference w:id="24"/>
+      </w:r>
+      <w:r>
+        <w:t>.</w:t>
+      </w:r>
+    </w:p>
+    <w:p/>
+    <w:p>
+      <w:r>
+        <w:t xml:space="preserve">If our hypothesis is true, that change is becoming a greater phenomenon and change voters more prevalent, then </w:t>
+      </w:r>
+      <w:r>
+        <w:t>future</w:t>
+      </w:r>
+      <w:r>
+        <w:t xml:space="preserve"> elections hold more </w:t>
+      </w:r>
+      <w:r>
+        <w:t>value for study, meaning that we can't fully prove the validity of the theory yet. For example, will we in 2028 have our first openly-gay candidate (Pete Buttigieg)</w:t>
+      </w:r>
+      <w:r>
+        <w:t>? Or will it be the second election in a row with a woman on the presidential stage (Alexandra Casio-Cortez)</w:t>
+      </w:r>
+      <w:r>
+        <w:t>?</w:t>
+      </w:r>
+    </w:p>
+    <w:p/>
+    <w:p>
+      <w:r>
+        <w:t>Separation from incumbency?</w:t>
+      </w:r>
+    </w:p>
+    <w:p/>
+    <w:p>
+      <w:r>
+        <w:t>Different variables across ANES makes being methodological very difficult.</w:t>
+      </w:r>
+    </w:p>
+    <w:p/>
+    <w:p>
+      <w:r>
+        <w:t xml:space="preserve">Change voter theory we develop is quite basic in that we only test using three variables, but as was discovered in the discrete validation tests (ie: filtering ANES other years), </w:t>
+      </w:r>
+      <w:r>
+        <w:t>the dataset doesn't allow us to filter for many more variables at once, because there are not enough respondents. So, a theory could be expanded with new or different data.</w:t>
+      </w:r>
+    </w:p>
+    <w:p/>
+    <w:p>
+      <w:r>
+        <w:t xml:space="preserve">ANES has no demographic. Maybe need </w:t>
       </w:r>
       <w:r>
         <w:rPr>
           <w:highlight w:val="magenta"/>
         </w:rPr>
-        <w:t>that polls and surveys for the 2016 election famously under-surveyed the demographics that ended up voting for Trump</w:t>
-      </w:r>
-      <w:r>
-        <w:t xml:space="preserve">, largely because Trump </w:t>
-      </w:r>
-      <w:r>
-        <w:t>succeeded in forming a new coalition of voters, many of which had not been voting in previous elections.</w:t>
-      </w:r>
-      <w:r>
-        <w:t xml:space="preserve"> Logically, this could mean that an important portion of the people that voted for Trump in 2016 are simply not represented in the ANES survey of that year, which is further evidence by a mismatch in the real-world popular vote margin and the one found in the ANES 2016 dataset</w:t>
-      </w:r>
-      <w:r>
-        <w:rPr>
-          <w:rStyle w:val="FootnoteReference"/>
-        </w:rPr>
-        <w:footnoteReference w:id="17"/>
-      </w:r>
-      <w:r>
-        <w:t xml:space="preserve">. Second, </w:t>
-      </w:r>
-      <w:r>
-        <w:t xml:space="preserve">that our </w:t>
-      </w:r>
-      <w:r>
-        <w:t xml:space="preserve">CCI measure is </w:t>
-      </w:r>
-      <w:r>
-        <w:t xml:space="preserve">imperfect (which it certainly is), and is severely </w:t>
-      </w:r>
-      <w:r>
-        <w:t xml:space="preserve">underrepresenting the </w:t>
-      </w:r>
-      <w:r>
-        <w:t>appeal</w:t>
-      </w:r>
-      <w:r>
-        <w:t xml:space="preserve"> that Clinton being th</w:t>
-      </w:r>
-      <w:r>
-        <w:t>e first</w:t>
-      </w:r>
-      <w:r>
-        <w:t>-</w:t>
-      </w:r>
-      <w:r>
-        <w:t>ev</w:t>
-      </w:r>
-      <w:r>
-        <w:t>er</w:t>
-      </w:r>
-      <w:r>
-        <w:t xml:space="preserve"> woman to reach the presidential stage </w:t>
-      </w:r>
-      <w:r>
-        <w:rPr>
-          <w:i/>
-          <w:iCs/>
-        </w:rPr>
-        <w:t>had</w:t>
-      </w:r>
-      <w:r>
-        <w:t xml:space="preserve"> for Change-Propense Voters.</w:t>
-      </w:r>
-      <w:r>
-        <w:t xml:space="preserve"> </w:t>
-      </w:r>
-      <w:r>
-        <w:t xml:space="preserve">For some voters looking for </w:t>
-      </w:r>
-      <w:r>
-        <w:t>change in 201</w:t>
-      </w:r>
-      <w:r>
-        <w:t>6,</w:t>
-      </w:r>
-      <w:r>
-        <w:t xml:space="preserve"> Clinton's gender </w:t>
-      </w:r>
-      <w:r>
-        <w:t xml:space="preserve">may have been </w:t>
-      </w:r>
-      <w:r>
-        <w:rPr>
-          <w:i/>
-          <w:iCs/>
-        </w:rPr>
-        <w:t xml:space="preserve">the </w:t>
-      </w:r>
-      <w:r>
-        <w:t xml:space="preserve">quintessential </w:t>
-      </w:r>
-      <w:r>
-        <w:t>indicator of 'change'</w:t>
-      </w:r>
-      <w:r>
-        <w:t>.</w:t>
-      </w:r>
-    </w:p>
-    <w:p>
-      <w:r>
-        <w:t>Finally, in 2020 we see the most stark behaviour in the LOESS curve between Biden and Trump.</w:t>
-      </w:r>
-      <w:r>
-        <w:t xml:space="preserve"> Here we see Trump, a particularly divisive incumbent who was dealing with the onset and aftermath of the first wave of the Covid-19 Pandemic in 2020, perform terribly among voters with higher change scores</w:t>
-      </w:r>
-      <w:r>
-        <w:t xml:space="preserve"> (</w:t>
+        <w:t>Cooperative Election Study</w:t>
+      </w:r>
+    </w:p>
+    <w:p/>
+    <w:p>
+      <w:r>
+        <w:rPr>
+          <w:b/>
+          <w:bCs/>
+        </w:rPr>
+        <w:t>Future Work</w:t>
+      </w:r>
+    </w:p>
+    <w:p>
+      <w:r>
+        <w:t xml:space="preserve">Textual Analysis - Use </w:t>
+      </w:r>
+      <w:r>
+        <w:t>word embeddings instead of a static dictionary</w:t>
+      </w:r>
+    </w:p>
+    <w:p/>
+    <w:p>
+      <w:r>
+        <w:t>Going deep instead of going wide (Analayze one or two docs per candidate more deeply, such as TF-IDF) instead of simple frequencies on many documents</w:t>
+      </w:r>
+    </w:p>
+    <w:p>
+      <w:pPr>
+        <w:rPr>
+          <w:b/>
+          <w:bCs/>
+        </w:rPr>
+      </w:pPr>
+      <w:r>
+        <w:rPr>
+          <w:b/>
+          <w:bCs/>
+        </w:rPr>
+        <w:t>Conclusions</w:t>
+      </w:r>
+    </w:p>
+    <w:p>
+      <w:r>
+        <w:t xml:space="preserve">Econ validated, Left-Right added, Info disproven. We also gain something about the not caring much about democracy as a self-evident issue to care for (sorry </w:t>
+      </w:r>
+      <w:r>
+        <w:t>Fukuyama</w:t>
+      </w:r>
+      <w:r>
+        <w:t>. a-la "I guess it's not self-evident after all").</w:t>
+      </w:r>
+    </w:p>
+    <w:p>
+      <w:pPr>
+        <w:rPr>
+          <w:b/>
+          <w:bCs/>
+        </w:rPr>
+      </w:pPr>
+    </w:p>
+    <w:p/>
+    <w:p>
+      <w:r>
+        <w:t>More closely examine the role of independents</w:t>
+      </w:r>
+      <w:r>
+        <w:t xml:space="preserve"> in the political system/ selling change/ taking legitimacy away from Dem/Reps attempting to sell change. Examine more closely than is done in </w:t>
       </w:r>
       <w:r>
         <w:rPr>
           <w:highlight w:val="magenta"/>
         </w:rPr>
-        <w:t>VCS</w:t>
-      </w:r>
-      <w:r>
-        <w:t>?)</w:t>
-      </w:r>
-      <w:r>
-        <w:t>, with Biden taking these voters</w:t>
-      </w:r>
-      <w:r>
-        <w:t xml:space="preserve"> comfortably.</w:t>
-      </w:r>
-    </w:p>
-    <w:p/>
-    <w:p/>
-    <w:p/>
-    <w:p/>
-    <w:p/>
-    <w:p/>
-    <w:p/>
-    <w:p>
-      <w:r>
-        <w:rPr>
-          <w:b/>
-          <w:bCs/>
-        </w:rPr>
-        <w:t xml:space="preserve">OVERALL </w:t>
-      </w:r>
-      <w:r>
-        <w:rPr>
-          <w:b/>
-          <w:bCs/>
-        </w:rPr>
-        <w:t>Discussion</w:t>
-      </w:r>
-      <w:r>
-        <w:rPr>
-          <w:b/>
-          <w:bCs/>
-        </w:rPr>
-        <w:t xml:space="preserve"> </w:t>
-      </w:r>
-      <w:r>
-        <w:rPr>
-          <w:b/>
-          <w:bCs/>
-        </w:rPr>
-        <w:t>(of all studies together)</w:t>
-      </w:r>
-      <w:r>
-        <w:rPr>
-          <w:b/>
-          <w:bCs/>
-        </w:rPr>
-        <w:t>, Implications</w:t>
-      </w:r>
-    </w:p>
-    <w:p/>
-    <w:p>
-      <w:r>
-        <w:t xml:space="preserve">Tough to say whether our hypothesis is true. The reality of real wage stagnation is having massive effects on electorate make-up, no doubt. </w:t>
-      </w:r>
-    </w:p>
-    <w:p>
-      <w:r>
-        <w:t>Our approach is good, but flawed.</w:t>
-      </w:r>
-    </w:p>
-    <w:p>
-      <w:pPr>
-        <w:rPr>
-          <w:b/>
-          <w:bCs/>
-        </w:rPr>
-      </w:pPr>
-    </w:p>
-    <w:p>
-      <w:pPr>
-        <w:rPr>
-          <w:b/>
-          <w:bCs/>
-        </w:rPr>
-      </w:pPr>
-    </w:p>
-    <w:p>
-      <w:pPr>
-        <w:rPr>
-          <w:b/>
-          <w:bCs/>
-        </w:rPr>
-      </w:pPr>
-    </w:p>
-    <w:p>
-      <w:pPr>
-        <w:rPr>
-          <w:b/>
-          <w:bCs/>
-        </w:rPr>
-      </w:pPr>
-    </w:p>
-    <w:p>
-      <w:pPr>
-        <w:rPr>
-          <w:b/>
-          <w:bCs/>
-        </w:rPr>
-      </w:pPr>
-    </w:p>
-    <w:p>
-      <w:r>
-        <w:rPr>
-          <w:b/>
-          <w:bCs/>
-        </w:rPr>
-        <w:t>LIMITATIONS</w:t>
-      </w:r>
-      <w:r>
-        <w:rPr>
-          <w:b/>
-          <w:bCs/>
-        </w:rPr>
-        <w:t xml:space="preserve"> and FUTURE WORK</w:t>
-      </w:r>
-    </w:p>
-    <w:p>
-      <w:r>
-        <w:rPr>
-          <w:b/>
-          <w:bCs/>
-        </w:rPr>
-        <w:t>Limitations</w:t>
-      </w:r>
-    </w:p>
-    <w:p>
-      <w:r>
-        <w:t xml:space="preserve">Change is not defined the same for everyone. Many people may consider themselves 'change' voters, and be voting for different </w:t>
-      </w:r>
-      <w:r>
-        <w:rPr>
-          <w:i/>
-          <w:iCs/>
-        </w:rPr>
-        <w:t>types</w:t>
-      </w:r>
-      <w:r>
-        <w:t xml:space="preserve"> of 'change'. An example could be our </w:t>
-      </w:r>
-      <w:r>
-        <w:t>failure to correctly assess Clinton's appeal in 2016</w:t>
-      </w:r>
-      <w:r>
-        <w:t xml:space="preserve"> and the fact that, </w:t>
-      </w:r>
-      <w:r>
-        <w:t>for some people</w:t>
-      </w:r>
-      <w:r>
-        <w:t>,</w:t>
-      </w:r>
-      <w:r>
-        <w:t xml:space="preserve"> the mere fact that she was a woman</w:t>
-      </w:r>
-      <w:r>
-        <w:rPr>
-          <w:rStyle w:val="FootnoteReference"/>
-        </w:rPr>
-        <w:footnoteReference w:id="18"/>
-      </w:r>
-      <w:r>
-        <w:t xml:space="preserve"> </w:t>
-      </w:r>
-      <w:r>
-        <w:t>was more than enough to see her as the candidate of 'Change'</w:t>
-      </w:r>
-      <w:r>
-        <w:rPr>
-          <w:rStyle w:val="FootnoteReference"/>
-        </w:rPr>
-        <w:footnoteReference w:id="19"/>
-      </w:r>
-      <w:r>
-        <w:t>.</w:t>
-      </w:r>
-    </w:p>
-    <w:p/>
-    <w:p>
-      <w:r>
-        <w:t xml:space="preserve">If our hypothesis is true, that change is becoming a greater phenomenon and change voters more prevalent, then </w:t>
-      </w:r>
-      <w:r>
-        <w:t>future</w:t>
-      </w:r>
-      <w:r>
-        <w:t xml:space="preserve"> elections hold more </w:t>
-      </w:r>
-      <w:r>
-        <w:t>value for study, meaning that we can't fully prove the validity of the theory yet. For example, will we in 2028 have our first openly-gay candidate (Pete Buttigieg)</w:t>
-      </w:r>
-      <w:r>
-        <w:t>? Or will it be the second election in a row with a woman on the presidential stage (Alexandra Casio-Cortez)</w:t>
-      </w:r>
-      <w:r>
-        <w:t>?</w:t>
-      </w:r>
-    </w:p>
-    <w:p/>
-    <w:p>
-      <w:r>
-        <w:t>Separation from incumbency?</w:t>
-      </w:r>
-    </w:p>
-    <w:p/>
-    <w:p>
-      <w:r>
-        <w:t>Different variables across ANES makes being methodological very difficult.</w:t>
-      </w:r>
-    </w:p>
-    <w:p/>
-    <w:p>
-      <w:r>
-        <w:t xml:space="preserve">Change voter theory we develop is quite basic in that we only test using three variables, but as was discovered in the discrete validation tests (ie: filtering ANES other years), </w:t>
-      </w:r>
-      <w:r>
-        <w:t>the dataset doesn't allow us to filter for many more variables at once, because there are not enough respondents. So, a theory could be expanded with new or different data.</w:t>
-      </w:r>
-    </w:p>
-    <w:p/>
-    <w:p>
-      <w:r>
-        <w:t xml:space="preserve">ANES has no demographic. Maybe need </w:t>
-      </w:r>
-      <w:r>
-        <w:rPr>
-          <w:highlight w:val="magenta"/>
-        </w:rPr>
-        <w:t>Cooperative Election Study</w:t>
-      </w:r>
-    </w:p>
-    <w:p/>
-    <w:p>
-      <w:r>
-        <w:rPr>
-          <w:b/>
-          <w:bCs/>
-        </w:rPr>
-        <w:t>Future Work</w:t>
-      </w:r>
-    </w:p>
-    <w:p>
-      <w:r>
-        <w:t xml:space="preserve">Textual Analysis - Use </w:t>
-      </w:r>
-      <w:r>
-        <w:t>word embeddings instead of a static dictionary</w:t>
-      </w:r>
-    </w:p>
-    <w:p/>
-    <w:p>
-      <w:r>
-        <w:t>Going deep instead of going wide (Analayze one or two docs per candidate more deeply, such as TF-IDF) instead of simple frequencies on many documents</w:t>
-      </w:r>
-    </w:p>
-    <w:p/>
-    <w:p/>
-    <w:p/>
-    <w:p/>
-    <w:p/>
-    <w:p/>
-    <w:p/>
-    <w:p/>
-    <w:p/>
-    <w:p/>
-    <w:p>
-      <w:pPr>
-        <w:rPr>
-          <w:b/>
-          <w:bCs/>
-        </w:rPr>
-      </w:pPr>
-      <w:r>
-        <w:rPr>
-          <w:b/>
-          <w:bCs/>
-        </w:rPr>
-        <w:t xml:space="preserve">APPENDICES </w:t>
-      </w:r>
-    </w:p>
-    <w:p>
-      <w:pPr>
-        <w:rPr>
-          <w:b/>
-          <w:bCs/>
-        </w:rPr>
-      </w:pPr>
-    </w:p>
-    <w:p/>
-    <w:p>
-      <w:r>
-        <w:t>find voters that voted Obama -&gt; Trump -&gt; Biden</w:t>
-      </w:r>
-    </w:p>
-    <w:p>
-      <w:r>
-        <w:t># V202072 - POST: Did R vote for President in this election</w:t>
-      </w:r>
-    </w:p>
-    <w:p>
-      <w:r>
-        <w:t xml:space="preserve">  # N: 8280-&gt;5952</w:t>
-      </w:r>
-    </w:p>
-    <w:p>
-      <w:r>
-        <w:t># V202073 - POST: For whom did R vote for President</w:t>
-      </w:r>
-    </w:p>
-    <w:p>
-      <w:r>
-        <w:t xml:space="preserve">  # Filter: Voted for change candidate (Biden) </w:t>
-      </w:r>
-    </w:p>
-    <w:p>
-      <w:r>
-        <w:t xml:space="preserve">  # N: 5952-&gt;3267 (means 55% voted Biden)</w:t>
-      </w:r>
-    </w:p>
-    <w:p>
-      <w:r>
-        <w:t xml:space="preserve"># PRE: Did R vote for President in 2016 </w:t>
-      </w:r>
-    </w:p>
-    <w:p>
-      <w:r>
-        <w:t xml:space="preserve">  # Filters out: refused q, didnt do post vote survey...</w:t>
-      </w:r>
-    </w:p>
-    <w:p>
-      <w:r>
-        <w:t xml:space="preserve">  # N: 3267-&gt;2820</w:t>
-      </w:r>
-    </w:p>
-    <w:p>
-      <w:r>
-        <w:t># V201103 - PRE: Recall of last (2016) Presidential vote choice</w:t>
-      </w:r>
-    </w:p>
-    <w:p>
-      <w:r>
-        <w:t xml:space="preserve">  # Filters out: refused q, didnt do post vote survey..  # Filter: VOTED for Donald Trump</w:t>
-      </w:r>
-    </w:p>
-    <w:p>
-      <w:r>
-        <w:t xml:space="preserve">  # N: 2820-&gt;189 (7% voted for Trump)</w:t>
-      </w:r>
-    </w:p>
-    <w:p>
-      <w:r>
-        <w:t># V201104 - PRE: Did R vote for president in 2012 election</w:t>
-      </w:r>
-    </w:p>
-    <w:p>
-      <w:r>
-        <w:t xml:space="preserve">  # Filters out: refused q, didnt participate in POST...</w:t>
-      </w:r>
-    </w:p>
-    <w:p>
-      <w:r>
-        <w:t xml:space="preserve">  # N: 189-&gt;89 (57% voted Obama)</w:t>
-      </w:r>
-    </w:p>
-    <w:p>
-      <w:r>
-        <w:t xml:space="preserve"># meaning that we have 89 people in this </w:t>
-      </w:r>
-    </w:p>
-    <w:p>
-      <w:pPr>
-        <w:rPr>
-          <w:b/>
-          <w:bCs/>
-        </w:rPr>
-      </w:pPr>
-      <w:r>
-        <w:t># dataset that voted Obama -&gt; Trump -&gt; Biden</w:t>
+        <w:t>Appendix G</w:t>
+      </w:r>
+      <w:r>
+        <w:t xml:space="preserve"> with discrete </w:t>
+      </w:r>
+      <w:r>
+        <w:t xml:space="preserve">probabilities </w:t>
+      </w:r>
+      <w:r>
+        <w:t>etc.</w:t>
+      </w:r>
+    </w:p>
+    <w:p/>
+    <w:p/>
+    <w:p/>
+    <w:p/>
+    <w:p/>
+    <w:p/>
+    <w:p/>
+    <w:p/>
+    <w:p>
+      <w:pPr>
+        <w:rPr>
+          <w:b/>
+          <w:bCs/>
+        </w:rPr>
+      </w:pPr>
+      <w:r>
+        <w:rPr>
+          <w:b/>
+          <w:bCs/>
+        </w:rPr>
+        <w:t xml:space="preserve"> </w:t>
       </w:r>
     </w:p>
     <w:sectPr>
@@ -7660,22 +7623,7 @@
         <w:footnoteRef/>
       </w:r>
       <w:r>
-        <w:t xml:space="preserve"> Clinton received 48% of the popular vote </w:t>
-      </w:r>
-      <w:r>
-        <w:t>in 2016 and Trump 46%, which is a 2% margin. Meanwhile, the ANES 2016 dataset</w:t>
-      </w:r>
-      <w:r>
-        <w:t xml:space="preserve"> paints Clinton as having a margin of 4%, indicating that there may be a systematic error </w:t>
-      </w:r>
-      <w:r>
-        <w:t xml:space="preserve">in the sampling employed </w:t>
-      </w:r>
-      <w:r>
-        <w:t xml:space="preserve">during the 2016 ANES, </w:t>
-      </w:r>
-      <w:r>
-        <w:t>which contributes to these bizarre 2016 Change Voter results.</w:t>
+        <w:t xml:space="preserve"> As industry becomes increasingly extractive, inflationary, and price-gouging, the profits taken home by the ultra wealthy increase at a rate higher than the incomes of the median.</w:t>
       </w:r>
     </w:p>
   </w:footnote>
@@ -7691,14 +7639,34 @@
         <w:footnoteRef/>
       </w:r>
       <w:r>
-        <w:t xml:space="preserve"> And the campaigns heavy reliance on this theme, seen clearly by the slogan "I'm With Her" </w:t>
+        <w:t xml:space="preserve"> </w:t>
+      </w:r>
+      <w:r>
+        <w:t>This would also explain their voting for Joe Biden (a famously blue-collar and labour union candidate [</w:t>
       </w:r>
       <w:r>
         <w:rPr>
           <w:highlight w:val="magenta"/>
         </w:rPr>
-        <w:t>(Citation)</w:t>
-      </w:r>
+        <w:t>citation</w:t>
+      </w:r>
+      <w:r>
+        <w:t>]) in 2020, and perhaps prime us to believe that they would have voted for the manufacturing candidate, Donald Trump (</w:t>
+      </w:r>
+      <w:r>
+        <w:rPr>
+          <w:highlight w:val="magenta"/>
+        </w:rPr>
+        <w:t>citation</w:t>
+      </w:r>
+      <w:r>
+        <w:t>), in 2024.</w:t>
+      </w:r>
+    </w:p>
+    <w:p>
+      <w:pPr>
+        <w:pStyle w:val="FootnoteText"/>
+      </w:pPr>
     </w:p>
   </w:footnote>
   <w:footnote w:id="19">
@@ -7712,11 +7680,267 @@
         </w:rPr>
         <w:footnoteRef/>
       </w:r>
+    </w:p>
+    <w:p>
+      <w:pPr>
+        <w:pStyle w:val="FootnoteText"/>
+      </w:pPr>
+      <w:r>
+        <w:t xml:space="preserve">On this </w:t>
+      </w:r>
+      <w:r>
+        <w:t xml:space="preserve">idea, </w:t>
+      </w:r>
+      <w:r>
+        <w:t xml:space="preserve">the </w:t>
+      </w:r>
+      <w:r>
+        <w:t xml:space="preserve">variables </w:t>
+      </w:r>
+      <w:r>
+        <w:t>identified as belonging to the theme of Perceptions of Future and Past correlate heavily with (and are arguably founded in) economic distress. The observed negative outlook that CVoters hold on the future (Hope) and low satisfaction</w:t>
+      </w:r>
+      <w:r>
+        <w:t xml:space="preserve"> </w:t>
+      </w:r>
+      <w:r>
+        <w:t xml:space="preserve">with the present (Happiness) </w:t>
+      </w:r>
+      <w:r>
+        <w:t>further validate</w:t>
+      </w:r>
+      <w:r>
+        <w:t xml:space="preserve"> the theory of a strong desire for change, but for the purposes of our theory, we wrap these results into the broader idea of Economic Distress as, </w:t>
+      </w:r>
+      <w:r>
+        <w:t>in our theory</w:t>
+      </w:r>
+      <w:r>
+        <w:t>, Economic Distress is the inceptive source of distress and is arguably a confounding variable on</w:t>
+      </w:r>
+      <w:r>
+        <w:t xml:space="preserve"> </w:t>
+      </w:r>
+      <w:r>
+        <w:t>voter 'Outlook' and 'W</w:t>
+      </w:r>
+      <w:r>
+        <w:t xml:space="preserve">anting </w:t>
+      </w:r>
+      <w:r>
+        <w:t>C</w:t>
+      </w:r>
+      <w:r>
+        <w:t>hange</w:t>
+      </w:r>
+      <w:r>
+        <w:t>'</w:t>
+      </w:r>
+      <w:r>
+        <w:t>(</w:t>
+      </w:r>
+      <w:r>
+        <w:rPr>
+          <w:highlight w:val="magenta"/>
+        </w:rPr>
+        <w:t>would need citation?).</w:t>
+      </w:r>
+    </w:p>
+  </w:footnote>
+  <w:footnote w:id="20">
+    <w:p>
+      <w:pPr>
+        <w:pStyle w:val="FootnoteText"/>
+      </w:pPr>
+      <w:r>
+        <w:rPr>
+          <w:rStyle w:val="FootnoteReference"/>
+        </w:rPr>
+        <w:footnoteRef/>
+      </w:r>
+      <w:r>
+        <w:t xml:space="preserve"> </w:t>
+      </w:r>
+      <w:r>
+        <w:t xml:space="preserve">Note: </w:t>
+      </w:r>
+      <w:r>
+        <w:t xml:space="preserve">The </w:t>
+      </w:r>
+      <w:r>
+        <w:t xml:space="preserve">probability of Change Voters choosing independent parties/candidates is </w:t>
+      </w:r>
+      <w:r>
+        <w:t>briefly</w:t>
+      </w:r>
+      <w:r>
+        <w:t xml:space="preserve"> studied</w:t>
+      </w:r>
+      <w:r>
+        <w:t xml:space="preserve"> in </w:t>
+      </w:r>
+      <w:r>
+        <w:rPr>
+          <w:highlight w:val="magenta"/>
+        </w:rPr>
+        <w:t>Appendix G</w:t>
+      </w:r>
+      <w:r>
+        <w:t xml:space="preserve">, which </w:t>
+      </w:r>
+      <w:r>
+        <w:t>attempts to describe</w:t>
+      </w:r>
+      <w:r>
+        <w:t xml:space="preserve"> the discrete probability of voting for candidates across different elections.</w:t>
+      </w:r>
+      <w:r>
+        <w:t xml:space="preserve"> Though the question of independents in the American system is fascinating and important, it is outside the scope of this paper, and thus not fully explored. </w:t>
+      </w:r>
+    </w:p>
+  </w:footnote>
+  <w:footnote w:id="21">
+    <w:p>
+      <w:pPr>
+        <w:pStyle w:val="FootnoteText"/>
+      </w:pPr>
+      <w:r>
+        <w:rPr>
+          <w:rStyle w:val="FootnoteReference"/>
+        </w:rPr>
+        <w:footnoteRef/>
+      </w:r>
+      <w:r>
+        <w:t xml:space="preserve"> Importantly, this observed apathy towards </w:t>
+      </w:r>
+      <w:r>
+        <w:t xml:space="preserve">in Change Voters towards </w:t>
+      </w:r>
+      <w:r>
+        <w:t>the safeguarding of Democracy is</w:t>
+      </w:r>
+      <w:r>
+        <w:t xml:space="preserve"> consistent with Harris's failure in 2024 to convince the electorate of </w:t>
+      </w:r>
+      <w:r>
+        <w:t>Trump</w:t>
+      </w:r>
+      <w:r>
+        <w:t xml:space="preserve">'s </w:t>
+      </w:r>
+      <w:r>
+        <w:t>existential threat to Democracy</w:t>
+      </w:r>
+      <w:r>
+        <w:t xml:space="preserve">, resulting in her loss </w:t>
+      </w:r>
+      <w:r>
+        <w:t>(</w:t>
+      </w:r>
+      <w:r>
+        <w:t xml:space="preserve">in a contest where she foreseeably could still have won as the 'Change' candidate, </w:t>
+      </w:r>
+      <w:r>
+        <w:t xml:space="preserve">given her </w:t>
+      </w:r>
+      <w:r>
+        <w:t xml:space="preserve">gender, race, and </w:t>
+      </w:r>
+      <w:r>
+        <w:t xml:space="preserve">late joining of the </w:t>
+      </w:r>
+      <w:r>
+        <w:t>contest</w:t>
+      </w:r>
+      <w:r>
+        <w:t>).</w:t>
+      </w:r>
+    </w:p>
+  </w:footnote>
+  <w:footnote w:id="22">
+    <w:p>
+      <w:pPr>
+        <w:pStyle w:val="FootnoteText"/>
+      </w:pPr>
+      <w:r>
+        <w:rPr>
+          <w:rStyle w:val="FootnoteReference"/>
+        </w:rPr>
+        <w:footnoteRef/>
+      </w:r>
+      <w:r>
+        <w:t xml:space="preserve"> Clinton received 48% of the popular vote </w:t>
+      </w:r>
+      <w:r>
+        <w:t>in 2016 and Trump 46%, which is a 2% margin. Meanwhile, the ANES 2016 dataset</w:t>
+      </w:r>
+      <w:r>
+        <w:t xml:space="preserve"> paints Clinton as having a margin of 4%, indicating that there may be a systematic error </w:t>
+      </w:r>
+      <w:r>
+        <w:t xml:space="preserve">in the sampling employed </w:t>
+      </w:r>
+      <w:r>
+        <w:t xml:space="preserve">during the 2016 ANES, </w:t>
+      </w:r>
+      <w:r>
+        <w:t>which contributes to these bizarre 2016 Change Voter results.</w:t>
+      </w:r>
+    </w:p>
+  </w:footnote>
+  <w:footnote w:id="23">
+    <w:p>
+      <w:pPr>
+        <w:pStyle w:val="FootnoteText"/>
+      </w:pPr>
+      <w:r>
+        <w:rPr>
+          <w:rStyle w:val="FootnoteReference"/>
+        </w:rPr>
+        <w:footnoteRef/>
+      </w:r>
+      <w:r>
+        <w:t xml:space="preserve"> And the campaigns heavy reliance on this theme, seen clearly by the slogan "I'm With Her" </w:t>
+      </w:r>
+      <w:r>
+        <w:rPr>
+          <w:highlight w:val="magenta"/>
+        </w:rPr>
+        <w:t>(Citation)</w:t>
+      </w:r>
+    </w:p>
+  </w:footnote>
+  <w:footnote w:id="24">
+    <w:p>
+      <w:pPr>
+        <w:pStyle w:val="FootnoteText"/>
+      </w:pPr>
+      <w:r>
+        <w:rPr>
+          <w:rStyle w:val="FootnoteReference"/>
+        </w:rPr>
+        <w:footnoteRef/>
+      </w:r>
       <w:r>
         <w:t xml:space="preserve"> Disregarding the fact that her husband had been president for eight years between 1992 and 2000, that she had worked as Secretary of State under Obama</w:t>
       </w:r>
       <w:r>
-        <w:t>, and for many, embodied the 'political elite' of Washington.</w:t>
+        <w:t>, and for many, embodied the 'political elite' of Washington</w:t>
+      </w:r>
+      <w:r>
+        <w:t xml:space="preserve"> (</w:t>
+      </w:r>
+      <w:r>
+        <w:rPr>
+          <w:highlight w:val="magenta"/>
+        </w:rPr>
+        <w:t>Citation</w:t>
+      </w:r>
+      <w:r>
+        <w:t>)</w:t>
+      </w:r>
+      <w:r>
+        <w:t>.</w:t>
       </w:r>
     </w:p>
   </w:footnote>
@@ -8687,7 +8911,6 @@
     <w:basedOn w:val="Normal"/>
     <w:link w:val="FootnoteTextChar"/>
     <w:uiPriority w:val="99"/>
-    <w:semiHidden/>
     <w:unhideWhenUsed/>
     <w:rsid w:val="006F57C1"/>
     <w:rPr>
@@ -8700,7 +8923,6 @@
     <w:basedOn w:val="DefaultParagraphFont"/>
     <w:link w:val="FootnoteText"/>
     <w:uiPriority w:val="99"/>
-    <w:semiHidden/>
     <w:rsid w:val="006F57C1"/>
     <w:rPr>
       <w:sz w:val="20"/>
@@ -8725,6 +8947,48 @@
     <w:semiHidden/>
     <w:unhideWhenUsed/>
     <w:rsid w:val="002C307E"/>
+  </w:style>
+  <w:style w:type="paragraph" w:styleId="Header">
+    <w:name w:val="header"/>
+    <w:basedOn w:val="Normal"/>
+    <w:link w:val="HeaderChar"/>
+    <w:uiPriority w:val="99"/>
+    <w:unhideWhenUsed/>
+    <w:rsid w:val="00D26233"/>
+    <w:pPr>
+      <w:tabs>
+        <w:tab w:val="center" w:pos="4680"/>
+        <w:tab w:val="right" w:pos="9360"/>
+      </w:tabs>
+    </w:pPr>
+  </w:style>
+  <w:style w:type="character" w:customStyle="1" w:styleId="HeaderChar">
+    <w:name w:val="Header Char"/>
+    <w:basedOn w:val="DefaultParagraphFont"/>
+    <w:link w:val="Header"/>
+    <w:uiPriority w:val="99"/>
+    <w:rsid w:val="00D26233"/>
+  </w:style>
+  <w:style w:type="paragraph" w:styleId="Footer">
+    <w:name w:val="footer"/>
+    <w:basedOn w:val="Normal"/>
+    <w:link w:val="FooterChar"/>
+    <w:uiPriority w:val="99"/>
+    <w:unhideWhenUsed/>
+    <w:rsid w:val="00D26233"/>
+    <w:pPr>
+      <w:tabs>
+        <w:tab w:val="center" w:pos="4680"/>
+        <w:tab w:val="right" w:pos="9360"/>
+      </w:tabs>
+    </w:pPr>
+  </w:style>
+  <w:style w:type="character" w:customStyle="1" w:styleId="FooterChar">
+    <w:name w:val="Footer Char"/>
+    <w:basedOn w:val="DefaultParagraphFont"/>
+    <w:link w:val="Footer"/>
+    <w:uiPriority w:val="99"/>
+    <w:rsid w:val="00D26233"/>
   </w:style>
 </w:styles>
 </file>

</xml_diff>